<commit_message>
fix: separate Earlier Positions bullets onto distinct lines (fixes missing Education heading)
</commit_message>
<xml_diff>
--- a/CV_Anders_G_Nordby_EN/CV_Anders_G_Nordby_EN_ATS.docx
+++ b/CV_Anders_G_Nordby_EN/CV_Anders_G_Nordby_EN_ATS.docx
@@ -280,6 +280,7 @@
     </w:p>
     <w:p>
       <w:pPr>
+        <w:pStyle w:val="Compact"/>
         <w:numPr>
           <w:ilvl w:val="0"/>
           <w:numId w:val="1001"/>
@@ -309,162 +310,12 @@
         <w:t xml:space="preserve">CGI</w:t>
       </w:r>
       <w:r>
-        <w:t xml:space="preserve">, Senior Web Developer-</w:t>
-      </w:r>
-      <w:r>
-        <w:t xml:space="preserve"> </w:t>
-      </w:r>
-      <w:r>
-        <w:rPr>
-          <w:i/>
-          <w:iCs/>
-        </w:rPr>
-        <w:t xml:space="preserve">03/2010 – 01/2014</w:t>
-      </w:r>
-      <w:r>
-        <w:t xml:space="preserve"> </w:t>
-      </w:r>
-      <w:r>
-        <w:t xml:space="preserve">—</w:t>
-      </w:r>
-      <w:r>
-        <w:t xml:space="preserve"> </w:t>
-      </w:r>
-      <w:r>
-        <w:rPr>
-          <w:b/>
-          <w:bCs/>
-        </w:rPr>
-        <w:t xml:space="preserve">Making Waves</w:t>
-      </w:r>
-      <w:r>
-        <w:t xml:space="preserve">, Senior Systems Consultant-</w:t>
-      </w:r>
-      <w:r>
-        <w:t xml:space="preserve"> </w:t>
-      </w:r>
-      <w:r>
-        <w:rPr>
-          <w:i/>
-          <w:iCs/>
-        </w:rPr>
-        <w:t xml:space="preserve">08/2008 – 12/2009</w:t>
-      </w:r>
-      <w:r>
-        <w:t xml:space="preserve"> </w:t>
-      </w:r>
-      <w:r>
-        <w:t xml:space="preserve">—</w:t>
-      </w:r>
-      <w:r>
-        <w:t xml:space="preserve"> </w:t>
-      </w:r>
-      <w:r>
-        <w:rPr>
-          <w:b/>
-          <w:bCs/>
-        </w:rPr>
-        <w:t xml:space="preserve">Creuna</w:t>
-      </w:r>
-      <w:r>
-        <w:t xml:space="preserve">, Consultant / Systems Developer-</w:t>
-      </w:r>
-      <w:r>
-        <w:t xml:space="preserve"> </w:t>
-      </w:r>
-      <w:r>
-        <w:rPr>
-          <w:i/>
-          <w:iCs/>
-        </w:rPr>
-        <w:t xml:space="preserve">02/2006 – 07/2008</w:t>
-      </w:r>
-      <w:r>
-        <w:t xml:space="preserve"> </w:t>
-      </w:r>
-      <w:r>
-        <w:t xml:space="preserve">—</w:t>
-      </w:r>
-      <w:r>
-        <w:t xml:space="preserve"> </w:t>
-      </w:r>
-      <w:r>
-        <w:rPr>
-          <w:b/>
-          <w:bCs/>
-        </w:rPr>
-        <w:t xml:space="preserve">Ocelluz</w:t>
-      </w:r>
-      <w:r>
-        <w:t xml:space="preserve">, Systems Developer &amp; Project Manager-</w:t>
-      </w:r>
-      <w:r>
-        <w:t xml:space="preserve"> </w:t>
-      </w:r>
-      <w:r>
-        <w:rPr>
-          <w:i/>
-          <w:iCs/>
-        </w:rPr>
-        <w:t xml:space="preserve">10/2004 – 02/2008</w:t>
-      </w:r>
-      <w:r>
-        <w:t xml:space="preserve"> </w:t>
-      </w:r>
-      <w:r>
-        <w:t xml:space="preserve">—</w:t>
-      </w:r>
-      <w:r>
-        <w:t xml:space="preserve"> </w:t>
-      </w:r>
-      <w:r>
-        <w:rPr>
-          <w:b/>
-          <w:bCs/>
-        </w:rPr>
-        <w:t xml:space="preserve">Anders Nordby Konsulenttjenester</w:t>
-      </w:r>
-      <w:r>
-        <w:t xml:space="preserve">-</w:t>
-      </w:r>
-      <w:r>
-        <w:t xml:space="preserve"> </w:t>
-      </w:r>
-      <w:r>
-        <w:rPr>
-          <w:i/>
-          <w:iCs/>
-        </w:rPr>
-        <w:t xml:space="preserve">05/1995 – 06/2002</w:t>
-      </w:r>
-      <w:r>
-        <w:t xml:space="preserve"> </w:t>
-      </w:r>
-      <w:r>
-        <w:t xml:space="preserve">—</w:t>
-      </w:r>
-      <w:r>
-        <w:t xml:space="preserve"> </w:t>
-      </w:r>
-      <w:r>
-        <w:rPr>
-          <w:b/>
-          <w:bCs/>
-        </w:rPr>
-        <w:t xml:space="preserve">Ajilon</w:t>
-      </w:r>
-      <w:r>
-        <w:t xml:space="preserve">, Consultant</w:t>
-      </w:r>
-      <w:r>
-        <w:t xml:space="preserve"> </w:t>
-      </w:r>
-      <w:r>
-        <w:t xml:space="preserve"># Education</w:t>
-      </w:r>
-    </w:p>
-    <w:p>
-      <w:pPr>
+        <w:t xml:space="preserve">, Senior Web Developer</w:t>
+      </w:r>
+    </w:p>
+    <w:p>
+      <w:pPr>
+        <w:pStyle w:val="Compact"/>
         <w:numPr>
           <w:ilvl w:val="0"/>
           <w:numId w:val="1001"/>
@@ -475,7 +326,7 @@
           <w:i/>
           <w:iCs/>
         </w:rPr>
-        <w:t xml:space="preserve">Current</w:t>
+        <w:t xml:space="preserve">03/2010 – 01/2014</w:t>
       </w:r>
       <w:r>
         <w:t xml:space="preserve"> </w:t>
@@ -491,14 +342,15 @@
           <w:b/>
           <w:bCs/>
         </w:rPr>
-        <w:t xml:space="preserve">Kristiania University of Applied Sciences</w:t>
-      </w:r>
-      <w:r>
-        <w:t xml:space="preserve">, Cloud Security</w:t>
-      </w:r>
-    </w:p>
-    <w:p>
-      <w:pPr>
+        <w:t xml:space="preserve">Making Waves</w:t>
+      </w:r>
+      <w:r>
+        <w:t xml:space="preserve">, Senior Systems Consultant</w:t>
+      </w:r>
+    </w:p>
+    <w:p>
+      <w:pPr>
+        <w:pStyle w:val="Compact"/>
         <w:numPr>
           <w:ilvl w:val="0"/>
           <w:numId w:val="1001"/>
@@ -509,7 +361,7 @@
           <w:i/>
           <w:iCs/>
         </w:rPr>
-        <w:t xml:space="preserve">2003 – 2004</w:t>
+        <w:t xml:space="preserve">08/2008 – 12/2009</w:t>
       </w:r>
       <w:r>
         <w:t xml:space="preserve"> </w:t>
@@ -525,14 +377,15 @@
           <w:b/>
           <w:bCs/>
         </w:rPr>
-        <w:t xml:space="preserve">University of Oslo</w:t>
-      </w:r>
-      <w:r>
-        <w:t xml:space="preserve">, Teacher Training</w:t>
-      </w:r>
-    </w:p>
-    <w:p>
-      <w:pPr>
+        <w:t xml:space="preserve">Creuna</w:t>
+      </w:r>
+      <w:r>
+        <w:t xml:space="preserve">, Consultant / Systems Developer</w:t>
+      </w:r>
+    </w:p>
+    <w:p>
+      <w:pPr>
+        <w:pStyle w:val="Compact"/>
         <w:numPr>
           <w:ilvl w:val="0"/>
           <w:numId w:val="1001"/>
@@ -543,7 +396,7 @@
           <w:i/>
           <w:iCs/>
         </w:rPr>
-        <w:t xml:space="preserve">1999 – 2000</w:t>
+        <w:t xml:space="preserve">02/2006 – 07/2008</w:t>
       </w:r>
       <w:r>
         <w:t xml:space="preserve"> </w:t>
@@ -559,14 +412,15 @@
           <w:b/>
           <w:bCs/>
         </w:rPr>
-        <w:t xml:space="preserve">Oslo Business Academy</w:t>
-      </w:r>
-      <w:r>
-        <w:t xml:space="preserve">, IT Candidate</w:t>
-      </w:r>
-    </w:p>
-    <w:p>
-      <w:pPr>
+        <w:t xml:space="preserve">Ocelluz</w:t>
+      </w:r>
+      <w:r>
+        <w:t xml:space="preserve">, Systems Developer &amp; Project Manager</w:t>
+      </w:r>
+    </w:p>
+    <w:p>
+      <w:pPr>
+        <w:pStyle w:val="Compact"/>
         <w:numPr>
           <w:ilvl w:val="0"/>
           <w:numId w:val="1001"/>
@@ -577,7 +431,7 @@
           <w:i/>
           <w:iCs/>
         </w:rPr>
-        <w:t xml:space="preserve">1987 – 1996</w:t>
+        <w:t xml:space="preserve">10/2004 – 02/2008</w:t>
       </w:r>
       <w:r>
         <w:t xml:space="preserve"> </w:t>
@@ -593,14 +447,12 @@
           <w:b/>
           <w:bCs/>
         </w:rPr>
-        <w:t xml:space="preserve">University of Oslo</w:t>
-      </w:r>
-      <w:r>
-        <w:t xml:space="preserve">, Cand.Mag.</w:t>
-      </w:r>
-    </w:p>
-    <w:p>
-      <w:pPr>
+        <w:t xml:space="preserve">Anders Nordby Konsulenttjenester</w:t>
+      </w:r>
+    </w:p>
+    <w:p>
+      <w:pPr>
+        <w:pStyle w:val="Compact"/>
         <w:numPr>
           <w:ilvl w:val="0"/>
           <w:numId w:val="1001"/>
@@ -611,7 +463,7 @@
           <w:i/>
           <w:iCs/>
         </w:rPr>
-        <w:t xml:space="preserve">1984 – 1987</w:t>
+        <w:t xml:space="preserve">05/1995 – 06/2002</w:t>
       </w:r>
       <w:r>
         <w:t xml:space="preserve"> </w:t>
@@ -627,21 +479,21 @@
           <w:b/>
           <w:bCs/>
         </w:rPr>
-        <w:t xml:space="preserve">Eikeli High School</w:t>
-      </w:r>
-      <w:r>
-        <w:t xml:space="preserve">, Natural Sciences</w:t>
+        <w:t xml:space="preserve">Ajilon</w:t>
+      </w:r>
+      <w:r>
+        <w:t xml:space="preserve">, Consultant</w:t>
       </w:r>
     </w:p>
     <w:bookmarkEnd w:id="14"/>
     <w:bookmarkEnd w:id="15"/>
-    <w:bookmarkStart w:id="16" w:name="certifications"/>
+    <w:bookmarkStart w:id="16" w:name="education"/>
     <w:p>
       <w:pPr>
         <w:pStyle w:val="Heading1"/>
       </w:pPr>
       <w:r>
-        <w:t xml:space="preserve">Certifications</w:t>
+        <w:t xml:space="preserve">Education</w:t>
       </w:r>
     </w:p>
     <w:p>
@@ -657,13 +509,26 @@
           <w:i/>
           <w:iCs/>
         </w:rPr>
-        <w:t xml:space="preserve">2025</w:t>
-      </w:r>
-      <w:r>
-        <w:t xml:space="preserve"> </w:t>
-      </w:r>
-      <w:r>
-        <w:t xml:space="preserve">— Goethe-Zertifikat Deutsch B2</w:t>
+        <w:t xml:space="preserve">Current</w:t>
+      </w:r>
+      <w:r>
+        <w:t xml:space="preserve"> </w:t>
+      </w:r>
+      <w:r>
+        <w:t xml:space="preserve">—</w:t>
+      </w:r>
+      <w:r>
+        <w:t xml:space="preserve"> </w:t>
+      </w:r>
+      <w:r>
+        <w:rPr>
+          <w:b/>
+          <w:bCs/>
+        </w:rPr>
+        <w:t xml:space="preserve">Kristiania University of Applied Sciences</w:t>
+      </w:r>
+      <w:r>
+        <w:t xml:space="preserve">, Cloud Security</w:t>
       </w:r>
     </w:p>
     <w:p>
@@ -679,13 +544,26 @@
           <w:i/>
           <w:iCs/>
         </w:rPr>
-        <w:t xml:space="preserve">2025</w:t>
-      </w:r>
-      <w:r>
-        <w:t xml:space="preserve"> </w:t>
-      </w:r>
-      <w:r>
-        <w:t xml:space="preserve">— SecureFlag: Secure Coding</w:t>
+        <w:t xml:space="preserve">2003 – 2004</w:t>
+      </w:r>
+      <w:r>
+        <w:t xml:space="preserve"> </w:t>
+      </w:r>
+      <w:r>
+        <w:t xml:space="preserve">—</w:t>
+      </w:r>
+      <w:r>
+        <w:t xml:space="preserve"> </w:t>
+      </w:r>
+      <w:r>
+        <w:rPr>
+          <w:b/>
+          <w:bCs/>
+        </w:rPr>
+        <w:t xml:space="preserve">University of Oslo</w:t>
+      </w:r>
+      <w:r>
+        <w:t xml:space="preserve">, Teacher Training</w:t>
       </w:r>
     </w:p>
     <w:p>
@@ -701,13 +579,26 @@
           <w:i/>
           <w:iCs/>
         </w:rPr>
-        <w:t xml:space="preserve">2021</w:t>
-      </w:r>
-      <w:r>
-        <w:t xml:space="preserve"> </w:t>
-      </w:r>
-      <w:r>
-        <w:t xml:space="preserve">— Certified Optimizely Developer</w:t>
+        <w:t xml:space="preserve">1999 – 2000</w:t>
+      </w:r>
+      <w:r>
+        <w:t xml:space="preserve"> </w:t>
+      </w:r>
+      <w:r>
+        <w:t xml:space="preserve">—</w:t>
+      </w:r>
+      <w:r>
+        <w:t xml:space="preserve"> </w:t>
+      </w:r>
+      <w:r>
+        <w:rPr>
+          <w:b/>
+          <w:bCs/>
+        </w:rPr>
+        <w:t xml:space="preserve">Oslo Business Academy</w:t>
+      </w:r>
+      <w:r>
+        <w:t xml:space="preserve">, IT Candidate</w:t>
       </w:r>
     </w:p>
     <w:p>
@@ -723,13 +614,26 @@
           <w:i/>
           <w:iCs/>
         </w:rPr>
-        <w:t xml:space="preserve">2020</w:t>
-      </w:r>
-      <w:r>
-        <w:t xml:space="preserve"> </w:t>
-      </w:r>
-      <w:r>
-        <w:t xml:space="preserve">— Microsoft AZ900 Azure Fundamentals</w:t>
+        <w:t xml:space="preserve">1987 – 1996</w:t>
+      </w:r>
+      <w:r>
+        <w:t xml:space="preserve"> </w:t>
+      </w:r>
+      <w:r>
+        <w:t xml:space="preserve">—</w:t>
+      </w:r>
+      <w:r>
+        <w:t xml:space="preserve"> </w:t>
+      </w:r>
+      <w:r>
+        <w:rPr>
+          <w:b/>
+          <w:bCs/>
+        </w:rPr>
+        <w:t xml:space="preserve">University of Oslo</w:t>
+      </w:r>
+      <w:r>
+        <w:t xml:space="preserve">, Cand.Mag.</w:t>
       </w:r>
     </w:p>
     <w:p>
@@ -745,45 +649,36 @@
           <w:i/>
           <w:iCs/>
         </w:rPr>
-        <w:t xml:space="preserve">2018-2019</w:t>
-      </w:r>
-      <w:r>
-        <w:t xml:space="preserve"> </w:t>
-      </w:r>
-      <w:r>
-        <w:t xml:space="preserve">— PRINCE2 Foundation &amp; Practitioner</w:t>
-      </w:r>
-    </w:p>
-    <w:p>
-      <w:pPr>
-        <w:pStyle w:val="Compact"/>
-        <w:numPr>
-          <w:ilvl w:val="0"/>
-          <w:numId w:val="1002"/>
-        </w:numPr>
-      </w:pPr>
-      <w:r>
-        <w:rPr>
-          <w:i/>
-          <w:iCs/>
-        </w:rPr>
-        <w:t xml:space="preserve">2019</w:t>
-      </w:r>
-      <w:r>
-        <w:t xml:space="preserve"> </w:t>
-      </w:r>
-      <w:r>
-        <w:t xml:space="preserve">— Certified Scrum Master</w:t>
+        <w:t xml:space="preserve">1984 – 1987</w:t>
+      </w:r>
+      <w:r>
+        <w:t xml:space="preserve"> </w:t>
+      </w:r>
+      <w:r>
+        <w:t xml:space="preserve">—</w:t>
+      </w:r>
+      <w:r>
+        <w:t xml:space="preserve"> </w:t>
+      </w:r>
+      <w:r>
+        <w:rPr>
+          <w:b/>
+          <w:bCs/>
+        </w:rPr>
+        <w:t xml:space="preserve">Eikeli High School</w:t>
+      </w:r>
+      <w:r>
+        <w:t xml:space="preserve">, Natural Sciences</w:t>
       </w:r>
     </w:p>
     <w:bookmarkEnd w:id="16"/>
-    <w:bookmarkStart w:id="17" w:name="courses"/>
+    <w:bookmarkStart w:id="17" w:name="certifications"/>
     <w:p>
       <w:pPr>
         <w:pStyle w:val="Heading1"/>
       </w:pPr>
       <w:r>
-        <w:t xml:space="preserve">Courses</w:t>
+        <w:t xml:space="preserve">Certifications</w:t>
       </w:r>
     </w:p>
     <w:p>
@@ -799,13 +694,13 @@
           <w:i/>
           <w:iCs/>
         </w:rPr>
-        <w:t xml:space="preserve">2024</w:t>
-      </w:r>
-      <w:r>
-        <w:t xml:space="preserve"> </w:t>
-      </w:r>
-      <w:r>
-        <w:t xml:space="preserve">— Building an AppSec Scanning Programme</w:t>
+        <w:t xml:space="preserve">2025</w:t>
+      </w:r>
+      <w:r>
+        <w:t xml:space="preserve"> </w:t>
+      </w:r>
+      <w:r>
+        <w:t xml:space="preserve">— Goethe-Zertifikat Deutsch B2</w:t>
       </w:r>
     </w:p>
     <w:p>
@@ -821,13 +716,13 @@
           <w:i/>
           <w:iCs/>
         </w:rPr>
-        <w:t xml:space="preserve">2019</w:t>
-      </w:r>
-      <w:r>
-        <w:t xml:space="preserve"> </w:t>
-      </w:r>
-      <w:r>
-        <w:t xml:space="preserve">— Tom Gilb: Architecture Workshop</w:t>
+        <w:t xml:space="preserve">2025</w:t>
+      </w:r>
+      <w:r>
+        <w:t xml:space="preserve"> </w:t>
+      </w:r>
+      <w:r>
+        <w:t xml:space="preserve">— SecureFlag: Secure Coding</w:t>
       </w:r>
     </w:p>
     <w:p>
@@ -843,13 +738,13 @@
           <w:i/>
           <w:iCs/>
         </w:rPr>
-        <w:t xml:space="preserve">2018</w:t>
-      </w:r>
-      <w:r>
-        <w:t xml:space="preserve"> </w:t>
-      </w:r>
-      <w:r>
-        <w:t xml:space="preserve">— Sopra Steria: Software Architecture School</w:t>
+        <w:t xml:space="preserve">2021</w:t>
+      </w:r>
+      <w:r>
+        <w:t xml:space="preserve"> </w:t>
+      </w:r>
+      <w:r>
+        <w:t xml:space="preserve">— Certified Optimizely Developer</w:t>
       </w:r>
     </w:p>
     <w:p>
@@ -865,23 +760,67 @@
           <w:i/>
           <w:iCs/>
         </w:rPr>
-        <w:t xml:space="preserve">2015</w:t>
-      </w:r>
-      <w:r>
-        <w:t xml:space="preserve"> </w:t>
-      </w:r>
-      <w:r>
-        <w:t xml:space="preserve">— Microsoft: Lead Enterprise Architect Programme</w:t>
+        <w:t xml:space="preserve">2020</w:t>
+      </w:r>
+      <w:r>
+        <w:t xml:space="preserve"> </w:t>
+      </w:r>
+      <w:r>
+        <w:t xml:space="preserve">— Microsoft AZ900 Azure Fundamentals</w:t>
+      </w:r>
+    </w:p>
+    <w:p>
+      <w:pPr>
+        <w:pStyle w:val="Compact"/>
+        <w:numPr>
+          <w:ilvl w:val="0"/>
+          <w:numId w:val="1003"/>
+        </w:numPr>
+      </w:pPr>
+      <w:r>
+        <w:rPr>
+          <w:i/>
+          <w:iCs/>
+        </w:rPr>
+        <w:t xml:space="preserve">2018-2019</w:t>
+      </w:r>
+      <w:r>
+        <w:t xml:space="preserve"> </w:t>
+      </w:r>
+      <w:r>
+        <w:t xml:space="preserve">— PRINCE2 Foundation &amp; Practitioner</w:t>
+      </w:r>
+    </w:p>
+    <w:p>
+      <w:pPr>
+        <w:pStyle w:val="Compact"/>
+        <w:numPr>
+          <w:ilvl w:val="0"/>
+          <w:numId w:val="1003"/>
+        </w:numPr>
+      </w:pPr>
+      <w:r>
+        <w:rPr>
+          <w:i/>
+          <w:iCs/>
+        </w:rPr>
+        <w:t xml:space="preserve">2019</w:t>
+      </w:r>
+      <w:r>
+        <w:t xml:space="preserve"> </w:t>
+      </w:r>
+      <w:r>
+        <w:t xml:space="preserve">— Certified Scrum Master</w:t>
       </w:r>
     </w:p>
     <w:bookmarkEnd w:id="17"/>
-    <w:bookmarkStart w:id="18" w:name="awards"/>
+    <w:bookmarkStart w:id="18" w:name="courses"/>
     <w:p>
       <w:pPr>
         <w:pStyle w:val="Heading1"/>
       </w:pPr>
       <w:r>
-        <w:t xml:space="preserve">Awards</w:t>
+        <w:t xml:space="preserve">Courses</w:t>
       </w:r>
     </w:p>
     <w:p>
@@ -897,69 +836,89 @@
           <w:i/>
           <w:iCs/>
         </w:rPr>
-        <w:t xml:space="preserve">2013-2017</w:t>
-      </w:r>
-      <w:r>
-        <w:t xml:space="preserve"> </w:t>
-      </w:r>
-      <w:r>
-        <w:t xml:space="preserve">— Episerver Most Valued Professional</w:t>
+        <w:t xml:space="preserve">2024</w:t>
+      </w:r>
+      <w:r>
+        <w:t xml:space="preserve"> </w:t>
+      </w:r>
+      <w:r>
+        <w:t xml:space="preserve">— Building an AppSec Scanning Programme</w:t>
+      </w:r>
+    </w:p>
+    <w:p>
+      <w:pPr>
+        <w:pStyle w:val="Compact"/>
+        <w:numPr>
+          <w:ilvl w:val="0"/>
+          <w:numId w:val="1004"/>
+        </w:numPr>
+      </w:pPr>
+      <w:r>
+        <w:rPr>
+          <w:i/>
+          <w:iCs/>
+        </w:rPr>
+        <w:t xml:space="preserve">2019</w:t>
+      </w:r>
+      <w:r>
+        <w:t xml:space="preserve"> </w:t>
+      </w:r>
+      <w:r>
+        <w:t xml:space="preserve">— Tom Gilb: Architecture Workshop</w:t>
+      </w:r>
+    </w:p>
+    <w:p>
+      <w:pPr>
+        <w:pStyle w:val="Compact"/>
+        <w:numPr>
+          <w:ilvl w:val="0"/>
+          <w:numId w:val="1004"/>
+        </w:numPr>
+      </w:pPr>
+      <w:r>
+        <w:rPr>
+          <w:i/>
+          <w:iCs/>
+        </w:rPr>
+        <w:t xml:space="preserve">2018</w:t>
+      </w:r>
+      <w:r>
+        <w:t xml:space="preserve"> </w:t>
+      </w:r>
+      <w:r>
+        <w:t xml:space="preserve">— Sopra Steria: Software Architecture School</w:t>
+      </w:r>
+    </w:p>
+    <w:p>
+      <w:pPr>
+        <w:pStyle w:val="Compact"/>
+        <w:numPr>
+          <w:ilvl w:val="0"/>
+          <w:numId w:val="1004"/>
+        </w:numPr>
+      </w:pPr>
+      <w:r>
+        <w:rPr>
+          <w:i/>
+          <w:iCs/>
+        </w:rPr>
+        <w:t xml:space="preserve">2015</w:t>
+      </w:r>
+      <w:r>
+        <w:t xml:space="preserve"> </w:t>
+      </w:r>
+      <w:r>
+        <w:t xml:space="preserve">— Microsoft: Lead Enterprise Architect Programme</w:t>
       </w:r>
     </w:p>
     <w:bookmarkEnd w:id="18"/>
-    <w:bookmarkStart w:id="19" w:name="skills"/>
+    <w:bookmarkStart w:id="19" w:name="awards"/>
     <w:p>
       <w:pPr>
         <w:pStyle w:val="Heading1"/>
       </w:pPr>
       <w:r>
-        <w:t xml:space="preserve">Skills</w:t>
-      </w:r>
-    </w:p>
-    <w:p>
-      <w:pPr>
-        <w:pStyle w:val="FirstParagraph"/>
-      </w:pPr>
-      <w:r>
-        <w:rPr>
-          <w:b/>
-          <w:bCs/>
-        </w:rPr>
-        <w:t xml:space="preserve">Processes:</w:t>
-      </w:r>
-      <w:r>
-        <w:t xml:space="preserve"> </w:t>
-      </w:r>
-      <w:r>
-        <w:t xml:space="preserve">Systems Architecture, Scrum, Kanban, Project Management</w:t>
-      </w:r>
-    </w:p>
-    <w:p>
-      <w:pPr>
-        <w:pStyle w:val="BodyText"/>
-      </w:pPr>
-      <w:r>
-        <w:rPr>
-          <w:b/>
-          <w:bCs/>
-        </w:rPr>
-        <w:t xml:space="preserve">Technology:</w:t>
-      </w:r>
-      <w:r>
-        <w:t xml:space="preserve"> </w:t>
-      </w:r>
-      <w:r>
-        <w:t xml:space="preserve">C#, Akka.Net, GraphQL, NHibernate, Blazor, Specflow, NUnit, Episerver, ASP.Net, SQL, Javascript, NServiceBus, REST, Powershell, Jira, Confluence, TeamCity, Octopus Deploy, Git, jMeter, BlazeMeter, Kiuwan, LaTeX</w:t>
-      </w:r>
-    </w:p>
-    <w:bookmarkEnd w:id="19"/>
-    <w:bookmarkStart w:id="20" w:name="languages"/>
-    <w:p>
-      <w:pPr>
-        <w:pStyle w:val="Heading1"/>
-      </w:pPr>
-      <w:r>
-        <w:t xml:space="preserve">Languages</w:t>
+        <w:t xml:space="preserve">Awards</w:t>
       </w:r>
     </w:p>
     <w:p>
@@ -972,16 +931,72 @@
       </w:pPr>
       <w:r>
         <w:rPr>
+          <w:i/>
+          <w:iCs/>
+        </w:rPr>
+        <w:t xml:space="preserve">2013-2017</w:t>
+      </w:r>
+      <w:r>
+        <w:t xml:space="preserve"> </w:t>
+      </w:r>
+      <w:r>
+        <w:t xml:space="preserve">— Episerver Most Valued Professional</w:t>
+      </w:r>
+    </w:p>
+    <w:bookmarkEnd w:id="19"/>
+    <w:bookmarkStart w:id="20" w:name="skills"/>
+    <w:p>
+      <w:pPr>
+        <w:pStyle w:val="Heading1"/>
+      </w:pPr>
+      <w:r>
+        <w:t xml:space="preserve">Skills</w:t>
+      </w:r>
+    </w:p>
+    <w:p>
+      <w:pPr>
+        <w:pStyle w:val="FirstParagraph"/>
+      </w:pPr>
+      <w:r>
+        <w:rPr>
           <w:b/>
           <w:bCs/>
         </w:rPr>
-        <w:t xml:space="preserve">Professional:</w:t>
-      </w:r>
-      <w:r>
-        <w:t xml:space="preserve"> </w:t>
-      </w:r>
-      <w:r>
-        <w:t xml:space="preserve">Norwegian (native), English</w:t>
+        <w:t xml:space="preserve">Processes:</w:t>
+      </w:r>
+      <w:r>
+        <w:t xml:space="preserve"> </w:t>
+      </w:r>
+      <w:r>
+        <w:t xml:space="preserve">Systems Architecture, Scrum, Kanban, Project Management</w:t>
+      </w:r>
+    </w:p>
+    <w:p>
+      <w:pPr>
+        <w:pStyle w:val="BodyText"/>
+      </w:pPr>
+      <w:r>
+        <w:rPr>
+          <w:b/>
+          <w:bCs/>
+        </w:rPr>
+        <w:t xml:space="preserve">Technology:</w:t>
+      </w:r>
+      <w:r>
+        <w:t xml:space="preserve"> </w:t>
+      </w:r>
+      <w:r>
+        <w:t xml:space="preserve">C#, Akka.Net, GraphQL, NHibernate, Blazor, Specflow, NUnit, Episerver, ASP.Net, SQL, Javascript, NServiceBus, REST, Powershell, Jira, Confluence, TeamCity, Octopus Deploy, Git, jMeter, BlazeMeter, Kiuwan, LaTeX</w:t>
+      </w:r>
+    </w:p>
+    <w:bookmarkEnd w:id="20"/>
+    <w:bookmarkStart w:id="21" w:name="languages"/>
+    <w:p>
+      <w:pPr>
+        <w:pStyle w:val="Heading1"/>
+      </w:pPr>
+      <w:r>
+        <w:t xml:space="preserve">Languages</w:t>
       </w:r>
     </w:p>
     <w:p>
@@ -989,7 +1004,7 @@
         <w:pStyle w:val="Compact"/>
         <w:numPr>
           <w:ilvl w:val="0"/>
-          <w:numId w:val="1005"/>
+          <w:numId w:val="1006"/>
         </w:numPr>
       </w:pPr>
       <w:r>
@@ -997,13 +1012,13 @@
           <w:b/>
           <w:bCs/>
         </w:rPr>
-        <w:t xml:space="preserve">Conversational:</w:t>
-      </w:r>
-      <w:r>
-        <w:t xml:space="preserve"> </w:t>
-      </w:r>
-      <w:r>
-        <w:t xml:space="preserve">German (B2), Bulgarian</w:t>
+        <w:t xml:space="preserve">Professional:</w:t>
+      </w:r>
+      <w:r>
+        <w:t xml:space="preserve"> </w:t>
+      </w:r>
+      <w:r>
+        <w:t xml:space="preserve">Norwegian (native), English</w:t>
       </w:r>
     </w:p>
     <w:p>
@@ -1011,7 +1026,7 @@
         <w:pStyle w:val="Compact"/>
         <w:numPr>
           <w:ilvl w:val="0"/>
-          <w:numId w:val="1005"/>
+          <w:numId w:val="1006"/>
         </w:numPr>
       </w:pPr>
       <w:r>
@@ -1019,6 +1034,28 @@
           <w:b/>
           <w:bCs/>
         </w:rPr>
+        <w:t xml:space="preserve">Conversational:</w:t>
+      </w:r>
+      <w:r>
+        <w:t xml:space="preserve"> </w:t>
+      </w:r>
+      <w:r>
+        <w:t xml:space="preserve">German (B2), Bulgarian</w:t>
+      </w:r>
+    </w:p>
+    <w:p>
+      <w:pPr>
+        <w:pStyle w:val="Compact"/>
+        <w:numPr>
+          <w:ilvl w:val="0"/>
+          <w:numId w:val="1006"/>
+        </w:numPr>
+      </w:pPr>
+      <w:r>
+        <w:rPr>
+          <w:b/>
+          <w:bCs/>
+        </w:rPr>
         <w:t xml:space="preserve">Beginner:</w:t>
       </w:r>
       <w:r>
@@ -1028,7 +1065,7 @@
         <w:t xml:space="preserve">Spanish, Catalan, Japanese</w:t>
       </w:r>
     </w:p>
-    <w:bookmarkEnd w:id="20"/>
+    <w:bookmarkEnd w:id="21"/>
     <w:sectPr>
       <w:footnotePr>
         <w:numRestart w:val="eachSect"/>
@@ -1258,6 +1295,9 @@
     <w:abstractNumId w:val="991"/>
   </w:num>
   <w:num w:numId="1005">
+    <w:abstractNumId w:val="991"/>
+  </w:num>
+  <w:num w:numId="1006">
     <w:abstractNumId w:val="991"/>
   </w:num>
 </w:numbering>

</xml_diff>

<commit_message>
publish: modernized ATS template (categorized skills, plain dates, sans-serif, parseable structure)
</commit_message>
<xml_diff>
--- a/CV_Anders_G_Nordby_EN/CV_Anders_G_Nordby_EN_ATS.docx
+++ b/CV_Anders_G_Nordby_EN/CV_Anders_G_Nordby_EN_ATS.docx
@@ -2,9 +2,10 @@
 <file path=word/document.xml><?xml version="1.0" encoding="utf-8"?>
 <w:document xmlns:w="http://schemas.openxmlformats.org/wordprocessingml/2006/main" xmlns:m="http://schemas.openxmlformats.org/officeDocument/2006/math" xmlns:r="http://schemas.openxmlformats.org/officeDocument/2006/relationships" xmlns:o="urn:schemas-microsoft-com:office:office" xmlns:v="urn:schemas-microsoft-com:vml" xmlns:w10="urn:schemas-microsoft-com:office:word" xmlns:a="http://schemas.openxmlformats.org/drawingml/2006/main" xmlns:pic="http://schemas.openxmlformats.org/drawingml/2006/picture" xmlns:wp="http://schemas.openxmlformats.org/drawingml/2006/wordprocessingDrawing">
   <w:body>
-    <w:p>
-      <w:pPr>
-        <w:pStyle w:val="Title"/>
+    <w:bookmarkStart w:id="9" w:name="anders-g.-nordby"/>
+    <w:p>
+      <w:pPr>
+        <w:pStyle w:val="Heading1"/>
       </w:pPr>
       <w:r>
         <w:t xml:space="preserve">Anders G. Nordby</w:t>
@@ -12,41 +13,14 @@
     </w:p>
     <w:p>
       <w:pPr>
-        <w:pStyle w:val="Author"/>
-      </w:pPr>
-      <w:r>
-        <w:t xml:space="preserve">anders@delichon.no | +47 932 20 333 |</w:t>
-      </w:r>
-      <w:r>
-        <w:t xml:space="preserve"> </w:t>
-      </w:r>
-      <w:hyperlink r:id="rId9">
-        <w:r>
-          <w:rPr>
-            <w:rStyle w:val="Hyperlink"/>
-          </w:rPr>
-          <w:t xml:space="preserve">https://www.linkedin.com/in/agnordby/</w:t>
-        </w:r>
-      </w:hyperlink>
-      <w:r>
-        <w:t xml:space="preserve"> </w:t>
-      </w:r>
-      <w:r>
-        <w:t xml:space="preserve">|</w:t>
-      </w:r>
-      <w:r>
-        <w:t xml:space="preserve"> </w:t>
-      </w:r>
-      <w:hyperlink r:id="rId10">
-        <w:r>
-          <w:rPr>
-            <w:rStyle w:val="Hyperlink"/>
-          </w:rPr>
-          <w:t xml:space="preserve">https://github.com/agnordby/cv</w:t>
-        </w:r>
-      </w:hyperlink>
-    </w:p>
-    <w:bookmarkStart w:id="11" w:name="professional-summary"/>
+        <w:pStyle w:val="FirstParagraph"/>
+      </w:pPr>
+      <w:r>
+        <w:t xml:space="preserve">anders@delichon.no · +47 932 20 333 · https://www.linkedin.com/in/agnordby/ · https://github.com/agnordby/cv</w:t>
+      </w:r>
+    </w:p>
+    <w:bookmarkEnd w:id="9"/>
+    <w:bookmarkStart w:id="10" w:name="professional-summary"/>
     <w:p>
       <w:pPr>
         <w:pStyle w:val="Heading1"/>
@@ -81,8 +55,8 @@
         <w:t xml:space="preserve">agile practices, and security governance.</w:t>
       </w:r>
     </w:p>
-    <w:bookmarkEnd w:id="11"/>
-    <w:bookmarkStart w:id="15" w:name="work-experience"/>
+    <w:bookmarkEnd w:id="10"/>
+    <w:bookmarkStart w:id="14" w:name="work-experience"/>
     <w:p>
       <w:pPr>
         <w:pStyle w:val="Heading1"/>
@@ -91,7 +65,7 @@
         <w:t xml:space="preserve">Work Experience</w:t>
       </w:r>
     </w:p>
-    <w:bookmarkStart w:id="12" w:name="X9a73373b15d20303f93cf63a2b92a5ba4cdae8e"/>
+    <w:bookmarkStart w:id="11" w:name="X9a73373b15d20303f93cf63a2b92a5ba4cdae8e"/>
     <w:p>
       <w:pPr>
         <w:pStyle w:val="Heading2"/>
@@ -104,12 +78,42 @@
       <w:pPr>
         <w:pStyle w:val="FirstParagraph"/>
       </w:pPr>
+      <w:r>
+        <w:t xml:space="preserve">05/2019 – present</w:t>
+      </w:r>
+    </w:p>
+    <w:p>
+      <w:pPr>
+        <w:pStyle w:val="BodyText"/>
+      </w:pPr>
+      <w:r>
+        <w:rPr>
+          <w:b/>
+          <w:bCs/>
+        </w:rPr>
+        <w:t xml:space="preserve">GEBHARDT Fördertechnik GmbH</w:t>
+      </w:r>
+      <w:r>
+        <w:t xml:space="preserve"> </w:t>
+      </w:r>
+      <w:r>
+        <w:t xml:space="preserve">— Senior Developer (3 months)</w:t>
+      </w:r>
+      <w:r>
+        <w:t xml:space="preserve"> </w:t>
+      </w:r>
       <w:r>
         <w:rPr>
           <w:i/>
           <w:iCs/>
         </w:rPr>
-        <w:t xml:space="preserve">05/2019 – present</w:t>
+        <w:t xml:space="preserve">Tech:</w:t>
+      </w:r>
+      <w:r>
+        <w:t xml:space="preserve"> </w:t>
+      </w:r>
+      <w:r>
+        <w:t xml:space="preserve">C#, .NET Core, GitLab, YouTrack, Powershell</w:t>
       </w:r>
     </w:p>
     <w:p>
@@ -121,13 +125,13 @@
           <w:b/>
           <w:bCs/>
         </w:rPr>
-        <w:t xml:space="preserve">GEBHARDT Fördertechnik GmbH</w:t>
-      </w:r>
-      <w:r>
-        <w:t xml:space="preserve"> </w:t>
-      </w:r>
-      <w:r>
-        <w:t xml:space="preserve">— Senior Developer (3 months)</w:t>
+        <w:t xml:space="preserve">Element Logic</w:t>
+      </w:r>
+      <w:r>
+        <w:t xml:space="preserve"> </w:t>
+      </w:r>
+      <w:r>
+        <w:t xml:space="preserve">(63 months)</w:t>
       </w:r>
       <w:r>
         <w:t xml:space="preserve"> </w:t>
@@ -143,7 +147,13 @@
         <w:t xml:space="preserve"> </w:t>
       </w:r>
       <w:r>
-        <w:t xml:space="preserve">C#, .NET Core, GitLab, YouTrack, Powershell</w:t>
+        <w:t xml:space="preserve">C#, Akka.NET, Blazor, REST, GraphQL, NHibernate, SQL, NUnit, Moq, Microsoft .NET Standard, ASP.NET, TeamCity, Octopus Deploy, Git, Powershell, Kiuwan</w:t>
+      </w:r>
+      <w:r>
+        <w:t xml:space="preserve"> </w:t>
+      </w:r>
+      <w:r>
+        <w:t xml:space="preserve">Senior developer on Element Logic’s main product, eManager. Additionally, focuses on application security, and is the initiator and leader for Element Logic’s Security Chapions Guild.</w:t>
       </w:r>
     </w:p>
     <w:p>
@@ -155,13 +165,13 @@
           <w:b/>
           <w:bCs/>
         </w:rPr>
-        <w:t xml:space="preserve">Element Logic</w:t>
-      </w:r>
-      <w:r>
-        <w:t xml:space="preserve"> </w:t>
-      </w:r>
-      <w:r>
-        <w:t xml:space="preserve">(63 months)</w:t>
+        <w:t xml:space="preserve">ABB</w:t>
+      </w:r>
+      <w:r>
+        <w:t xml:space="preserve"> </w:t>
+      </w:r>
+      <w:r>
+        <w:t xml:space="preserve">— Senior Systems Developer (6 months)</w:t>
       </w:r>
       <w:r>
         <w:t xml:space="preserve"> </w:t>
@@ -177,13 +187,25 @@
         <w:t xml:space="preserve"> </w:t>
       </w:r>
       <w:r>
-        <w:t xml:space="preserve">C#, Akka.NET, Blazor, REST, GraphQL, NHibernate, SQL, NUnit, Moq, Microsoft .NET Standard, ASP.NET, TeamCity, Octopus Deploy, Git, Powershell, Kiuwan</w:t>
-      </w:r>
-      <w:r>
-        <w:t xml:space="preserve"> </w:t>
-      </w:r>
-      <w:r>
-        <w:t xml:space="preserve">Senior developer on Element Logic’s main product, eManager. Additionally, focuses on application security, and is the initiator and leader for Element Logic’s Security Chapions Guild.</w:t>
+        <w:t xml:space="preserve">Azure DevOps, Azure DB, Azure WebServices, Akka.NET, TypeScript, React JS, C#, Microsoft .NET Core, TFS, Git, Powershell</w:t>
+      </w:r>
+    </w:p>
+    <w:bookmarkEnd w:id="11"/>
+    <w:bookmarkStart w:id="12" w:name="lead-software-engineer-sopra-steria"/>
+    <w:p>
+      <w:pPr>
+        <w:pStyle w:val="Heading2"/>
+      </w:pPr>
+      <w:r>
+        <w:t xml:space="preserve">Lead Software Engineer — Sopra Steria</w:t>
+      </w:r>
+    </w:p>
+    <w:p>
+      <w:pPr>
+        <w:pStyle w:val="FirstParagraph"/>
+      </w:pPr>
+      <w:r>
+        <w:t xml:space="preserve">01/2018 – 04/2019</w:t>
       </w:r>
     </w:p>
     <w:p>
@@ -191,43 +213,490 @@
         <w:pStyle w:val="BodyText"/>
       </w:pPr>
       <w:r>
-        <w:rPr>
-          <w:b/>
-          <w:bCs/>
-        </w:rPr>
-        <w:t xml:space="preserve">ABB</w:t>
-      </w:r>
-      <w:r>
-        <w:t xml:space="preserve"> </w:t>
-      </w:r>
-      <w:r>
-        <w:t xml:space="preserve">— Senior Systems Developer (6 months)</w:t>
-      </w:r>
-      <w:r>
-        <w:t xml:space="preserve"> </w:t>
-      </w:r>
-      <w:r>
-        <w:rPr>
-          <w:i/>
-          <w:iCs/>
-        </w:rPr>
-        <w:t xml:space="preserve">Tech:</w:t>
-      </w:r>
-      <w:r>
-        <w:t xml:space="preserve"> </w:t>
-      </w:r>
-      <w:r>
-        <w:t xml:space="preserve">Azure DevOps, Azure DB, Azure WebServices, Akka.NET, TypeScript, React JS, C#, Microsoft .NET Core, TFS, Git, Powershell</w:t>
+        <w:t xml:space="preserve">In-house architect responsible for planning and QA of offers to customers. Senior developer for some customers.</w:t>
+      </w:r>
+    </w:p>
+    <w:p>
+      <w:pPr>
+        <w:pStyle w:val="BodyText"/>
+      </w:pPr>
+      <w:r>
+        <w:rPr>
+          <w:b/>
+          <w:bCs/>
+        </w:rPr>
+        <w:t xml:space="preserve">Customers:</w:t>
+      </w:r>
+      <w:r>
+        <w:t xml:space="preserve"> </w:t>
+      </w:r>
+      <w:r>
+        <w:t xml:space="preserve">Skatteetaten, Helsedirektoratet</w:t>
       </w:r>
     </w:p>
     <w:bookmarkEnd w:id="12"/>
-    <w:bookmarkStart w:id="13" w:name="lead-software-engineer-sopra-steria"/>
+    <w:bookmarkStart w:id="13" w:name="earlier-positions"/>
     <w:p>
       <w:pPr>
         <w:pStyle w:val="Heading2"/>
       </w:pPr>
       <w:r>
-        <w:t xml:space="preserve">Lead Software Engineer — Sopra Steria</w:t>
+        <w:t xml:space="preserve">Earlier Positions</w:t>
+      </w:r>
+    </w:p>
+    <w:p>
+      <w:pPr>
+        <w:pStyle w:val="Compact"/>
+        <w:numPr>
+          <w:ilvl w:val="0"/>
+          <w:numId w:val="1001"/>
+        </w:numPr>
+      </w:pPr>
+      <w:r>
+        <w:t xml:space="preserve">03/2014 – 08/2017 —</w:t>
+      </w:r>
+      <w:r>
+        <w:t xml:space="preserve"> </w:t>
+      </w:r>
+      <w:r>
+        <w:rPr>
+          <w:b/>
+          <w:bCs/>
+        </w:rPr>
+        <w:t xml:space="preserve">CGI</w:t>
+      </w:r>
+      <w:r>
+        <w:t xml:space="preserve">, Senior Web Developer</w:t>
+      </w:r>
+    </w:p>
+    <w:p>
+      <w:pPr>
+        <w:pStyle w:val="Compact"/>
+        <w:numPr>
+          <w:ilvl w:val="0"/>
+          <w:numId w:val="1001"/>
+        </w:numPr>
+      </w:pPr>
+      <w:r>
+        <w:t xml:space="preserve">03/2010 – 01/2014 —</w:t>
+      </w:r>
+      <w:r>
+        <w:t xml:space="preserve"> </w:t>
+      </w:r>
+      <w:r>
+        <w:rPr>
+          <w:b/>
+          <w:bCs/>
+        </w:rPr>
+        <w:t xml:space="preserve">Making Waves</w:t>
+      </w:r>
+      <w:r>
+        <w:t xml:space="preserve">, Senior Systems Consultant</w:t>
+      </w:r>
+    </w:p>
+    <w:p>
+      <w:pPr>
+        <w:pStyle w:val="Compact"/>
+        <w:numPr>
+          <w:ilvl w:val="0"/>
+          <w:numId w:val="1001"/>
+        </w:numPr>
+      </w:pPr>
+      <w:r>
+        <w:t xml:space="preserve">08/2008 – 12/2009 —</w:t>
+      </w:r>
+      <w:r>
+        <w:t xml:space="preserve"> </w:t>
+      </w:r>
+      <w:r>
+        <w:rPr>
+          <w:b/>
+          <w:bCs/>
+        </w:rPr>
+        <w:t xml:space="preserve">Creuna</w:t>
+      </w:r>
+      <w:r>
+        <w:t xml:space="preserve">, Consultant / Systems Developer</w:t>
+      </w:r>
+    </w:p>
+    <w:p>
+      <w:pPr>
+        <w:pStyle w:val="Compact"/>
+        <w:numPr>
+          <w:ilvl w:val="0"/>
+          <w:numId w:val="1001"/>
+        </w:numPr>
+      </w:pPr>
+      <w:r>
+        <w:t xml:space="preserve">02/2006 – 07/2008 —</w:t>
+      </w:r>
+      <w:r>
+        <w:t xml:space="preserve"> </w:t>
+      </w:r>
+      <w:r>
+        <w:rPr>
+          <w:b/>
+          <w:bCs/>
+        </w:rPr>
+        <w:t xml:space="preserve">Ocelluz</w:t>
+      </w:r>
+      <w:r>
+        <w:t xml:space="preserve">, Systems Developer &amp; Project Manager</w:t>
+      </w:r>
+    </w:p>
+    <w:p>
+      <w:pPr>
+        <w:pStyle w:val="Compact"/>
+        <w:numPr>
+          <w:ilvl w:val="0"/>
+          <w:numId w:val="1001"/>
+        </w:numPr>
+      </w:pPr>
+      <w:r>
+        <w:t xml:space="preserve">10/2004 – 02/2008 —</w:t>
+      </w:r>
+      <w:r>
+        <w:t xml:space="preserve"> </w:t>
+      </w:r>
+      <w:r>
+        <w:rPr>
+          <w:b/>
+          <w:bCs/>
+        </w:rPr>
+        <w:t xml:space="preserve">Anders Nordby Konsulenttjenester</w:t>
+      </w:r>
+    </w:p>
+    <w:p>
+      <w:pPr>
+        <w:pStyle w:val="Compact"/>
+        <w:numPr>
+          <w:ilvl w:val="0"/>
+          <w:numId w:val="1001"/>
+        </w:numPr>
+      </w:pPr>
+      <w:r>
+        <w:t xml:space="preserve">05/1995 – 06/2002 —</w:t>
+      </w:r>
+      <w:r>
+        <w:t xml:space="preserve"> </w:t>
+      </w:r>
+      <w:r>
+        <w:rPr>
+          <w:b/>
+          <w:bCs/>
+        </w:rPr>
+        <w:t xml:space="preserve">Ajilon</w:t>
+      </w:r>
+      <w:r>
+        <w:t xml:space="preserve">, Consultant</w:t>
+      </w:r>
+    </w:p>
+    <w:bookmarkEnd w:id="13"/>
+    <w:bookmarkEnd w:id="14"/>
+    <w:bookmarkStart w:id="15" w:name="education"/>
+    <w:p>
+      <w:pPr>
+        <w:pStyle w:val="Heading1"/>
+      </w:pPr>
+      <w:r>
+        <w:t xml:space="preserve">Education</w:t>
+      </w:r>
+    </w:p>
+    <w:p>
+      <w:pPr>
+        <w:pStyle w:val="Compact"/>
+        <w:numPr>
+          <w:ilvl w:val="0"/>
+          <w:numId w:val="1002"/>
+        </w:numPr>
+      </w:pPr>
+      <w:r>
+        <w:t xml:space="preserve">Current —</w:t>
+      </w:r>
+      <w:r>
+        <w:t xml:space="preserve"> </w:t>
+      </w:r>
+      <w:r>
+        <w:rPr>
+          <w:b/>
+          <w:bCs/>
+        </w:rPr>
+        <w:t xml:space="preserve">Kristiania University of Applied Sciences</w:t>
+      </w:r>
+      <w:r>
+        <w:t xml:space="preserve">, Cloud Security</w:t>
+      </w:r>
+    </w:p>
+    <w:p>
+      <w:pPr>
+        <w:pStyle w:val="Compact"/>
+        <w:numPr>
+          <w:ilvl w:val="0"/>
+          <w:numId w:val="1002"/>
+        </w:numPr>
+      </w:pPr>
+      <w:r>
+        <w:t xml:space="preserve">2003 – 2004 —</w:t>
+      </w:r>
+      <w:r>
+        <w:t xml:space="preserve"> </w:t>
+      </w:r>
+      <w:r>
+        <w:rPr>
+          <w:b/>
+          <w:bCs/>
+        </w:rPr>
+        <w:t xml:space="preserve">University of Oslo</w:t>
+      </w:r>
+      <w:r>
+        <w:t xml:space="preserve">, Teacher Training</w:t>
+      </w:r>
+    </w:p>
+    <w:p>
+      <w:pPr>
+        <w:pStyle w:val="Compact"/>
+        <w:numPr>
+          <w:ilvl w:val="0"/>
+          <w:numId w:val="1002"/>
+        </w:numPr>
+      </w:pPr>
+      <w:r>
+        <w:t xml:space="preserve">1999 – 2000 —</w:t>
+      </w:r>
+      <w:r>
+        <w:t xml:space="preserve"> </w:t>
+      </w:r>
+      <w:r>
+        <w:rPr>
+          <w:b/>
+          <w:bCs/>
+        </w:rPr>
+        <w:t xml:space="preserve">Oslo Business Academy</w:t>
+      </w:r>
+      <w:r>
+        <w:t xml:space="preserve">, IT Candidate</w:t>
+      </w:r>
+    </w:p>
+    <w:p>
+      <w:pPr>
+        <w:pStyle w:val="Compact"/>
+        <w:numPr>
+          <w:ilvl w:val="0"/>
+          <w:numId w:val="1002"/>
+        </w:numPr>
+      </w:pPr>
+      <w:r>
+        <w:t xml:space="preserve">1987 – 1996 —</w:t>
+      </w:r>
+      <w:r>
+        <w:t xml:space="preserve"> </w:t>
+      </w:r>
+      <w:r>
+        <w:rPr>
+          <w:b/>
+          <w:bCs/>
+        </w:rPr>
+        <w:t xml:space="preserve">University of Oslo</w:t>
+      </w:r>
+      <w:r>
+        <w:t xml:space="preserve">, Cand.Mag.</w:t>
+      </w:r>
+    </w:p>
+    <w:p>
+      <w:pPr>
+        <w:pStyle w:val="Compact"/>
+        <w:numPr>
+          <w:ilvl w:val="0"/>
+          <w:numId w:val="1002"/>
+        </w:numPr>
+      </w:pPr>
+      <w:r>
+        <w:t xml:space="preserve">1984 – 1987 —</w:t>
+      </w:r>
+      <w:r>
+        <w:t xml:space="preserve"> </w:t>
+      </w:r>
+      <w:r>
+        <w:rPr>
+          <w:b/>
+          <w:bCs/>
+        </w:rPr>
+        <w:t xml:space="preserve">Eikeli High School</w:t>
+      </w:r>
+      <w:r>
+        <w:t xml:space="preserve">, Natural Sciences</w:t>
+      </w:r>
+    </w:p>
+    <w:bookmarkEnd w:id="15"/>
+    <w:bookmarkStart w:id="16" w:name="certifications"/>
+    <w:p>
+      <w:pPr>
+        <w:pStyle w:val="Heading1"/>
+      </w:pPr>
+      <w:r>
+        <w:t xml:space="preserve">Certifications</w:t>
+      </w:r>
+    </w:p>
+    <w:p>
+      <w:pPr>
+        <w:pStyle w:val="Compact"/>
+        <w:numPr>
+          <w:ilvl w:val="0"/>
+          <w:numId w:val="1003"/>
+        </w:numPr>
+      </w:pPr>
+      <w:r>
+        <w:t xml:space="preserve">2025 — Goethe-Zertifikat Deutsch B2</w:t>
+      </w:r>
+    </w:p>
+    <w:p>
+      <w:pPr>
+        <w:pStyle w:val="Compact"/>
+        <w:numPr>
+          <w:ilvl w:val="0"/>
+          <w:numId w:val="1003"/>
+        </w:numPr>
+      </w:pPr>
+      <w:r>
+        <w:t xml:space="preserve">2025 — SecureFlag: Secure Coding</w:t>
+      </w:r>
+    </w:p>
+    <w:p>
+      <w:pPr>
+        <w:pStyle w:val="Compact"/>
+        <w:numPr>
+          <w:ilvl w:val="0"/>
+          <w:numId w:val="1003"/>
+        </w:numPr>
+      </w:pPr>
+      <w:r>
+        <w:t xml:space="preserve">2021 — Certified Optimizely Developer</w:t>
+      </w:r>
+    </w:p>
+    <w:p>
+      <w:pPr>
+        <w:pStyle w:val="Compact"/>
+        <w:numPr>
+          <w:ilvl w:val="0"/>
+          <w:numId w:val="1003"/>
+        </w:numPr>
+      </w:pPr>
+      <w:r>
+        <w:t xml:space="preserve">2020 — Microsoft AZ900 Azure Fundamentals</w:t>
+      </w:r>
+    </w:p>
+    <w:p>
+      <w:pPr>
+        <w:pStyle w:val="Compact"/>
+        <w:numPr>
+          <w:ilvl w:val="0"/>
+          <w:numId w:val="1003"/>
+        </w:numPr>
+      </w:pPr>
+      <w:r>
+        <w:t xml:space="preserve">2018-2019 — PRINCE2 Foundation &amp; Practitioner</w:t>
+      </w:r>
+    </w:p>
+    <w:p>
+      <w:pPr>
+        <w:pStyle w:val="Compact"/>
+        <w:numPr>
+          <w:ilvl w:val="0"/>
+          <w:numId w:val="1003"/>
+        </w:numPr>
+      </w:pPr>
+      <w:r>
+        <w:t xml:space="preserve">2019 — Certified Scrum Master</w:t>
+      </w:r>
+    </w:p>
+    <w:bookmarkEnd w:id="16"/>
+    <w:bookmarkStart w:id="17" w:name="courses"/>
+    <w:p>
+      <w:pPr>
+        <w:pStyle w:val="Heading1"/>
+      </w:pPr>
+      <w:r>
+        <w:t xml:space="preserve">Courses</w:t>
+      </w:r>
+    </w:p>
+    <w:p>
+      <w:pPr>
+        <w:pStyle w:val="Compact"/>
+        <w:numPr>
+          <w:ilvl w:val="0"/>
+          <w:numId w:val="1004"/>
+        </w:numPr>
+      </w:pPr>
+      <w:r>
+        <w:t xml:space="preserve">2024 — Building an AppSec Scanning Programme</w:t>
+      </w:r>
+    </w:p>
+    <w:p>
+      <w:pPr>
+        <w:pStyle w:val="Compact"/>
+        <w:numPr>
+          <w:ilvl w:val="0"/>
+          <w:numId w:val="1004"/>
+        </w:numPr>
+      </w:pPr>
+      <w:r>
+        <w:t xml:space="preserve">2019 — Tom Gilb: Architecture Workshop</w:t>
+      </w:r>
+    </w:p>
+    <w:p>
+      <w:pPr>
+        <w:pStyle w:val="Compact"/>
+        <w:numPr>
+          <w:ilvl w:val="0"/>
+          <w:numId w:val="1004"/>
+        </w:numPr>
+      </w:pPr>
+      <w:r>
+        <w:t xml:space="preserve">2018 — Sopra Steria: Software Architecture School</w:t>
+      </w:r>
+    </w:p>
+    <w:p>
+      <w:pPr>
+        <w:pStyle w:val="Compact"/>
+        <w:numPr>
+          <w:ilvl w:val="0"/>
+          <w:numId w:val="1004"/>
+        </w:numPr>
+      </w:pPr>
+      <w:r>
+        <w:t xml:space="preserve">2015 — Microsoft: Lead Enterprise Architect Programme</w:t>
+      </w:r>
+    </w:p>
+    <w:bookmarkEnd w:id="17"/>
+    <w:bookmarkStart w:id="18" w:name="awards"/>
+    <w:p>
+      <w:pPr>
+        <w:pStyle w:val="Heading1"/>
+      </w:pPr>
+      <w:r>
+        <w:t xml:space="preserve">Awards</w:t>
+      </w:r>
+    </w:p>
+    <w:p>
+      <w:pPr>
+        <w:pStyle w:val="Compact"/>
+        <w:numPr>
+          <w:ilvl w:val="0"/>
+          <w:numId w:val="1005"/>
+        </w:numPr>
+      </w:pPr>
+      <w:r>
+        <w:t xml:space="preserve">2013-2017 — Episerver Most Valued Professional</w:t>
+      </w:r>
+    </w:p>
+    <w:bookmarkEnd w:id="18"/>
+    <w:bookmarkStart w:id="19" w:name="skills"/>
+    <w:p>
+      <w:pPr>
+        <w:pStyle w:val="Heading1"/>
+      </w:pPr>
+      <w:r>
+        <w:t xml:space="preserve">Skills</w:t>
       </w:r>
     </w:p>
     <w:p>
@@ -236,10 +705,16 @@
       </w:pPr>
       <w:r>
         <w:rPr>
-          <w:i/>
-          <w:iCs/>
-        </w:rPr>
-        <w:t xml:space="preserve">01/2018 – 04/2019</w:t>
+          <w:b/>
+          <w:bCs/>
+        </w:rPr>
+        <w:t xml:space="preserve">Languages:</w:t>
+      </w:r>
+      <w:r>
+        <w:t xml:space="preserve"> </w:t>
+      </w:r>
+      <w:r>
+        <w:t xml:space="preserve">C#, JavaScript, SQL, PowerShell</w:t>
       </w:r>
     </w:p>
     <w:p>
@@ -247,7 +722,17 @@
         <w:pStyle w:val="BodyText"/>
       </w:pPr>
       <w:r>
-        <w:t xml:space="preserve">In-house architect responsible for planning and QA of offers to customers. Senior developer for some customers.</w:t>
+        <w:rPr>
+          <w:b/>
+          <w:bCs/>
+        </w:rPr>
+        <w:t xml:space="preserve">Frameworks &amp; Libraries:</w:t>
+      </w:r>
+      <w:r>
+        <w:t xml:space="preserve"> </w:t>
+      </w:r>
+      <w:r>
+        <w:t xml:space="preserve">ASP.NET, Akka.NET, Blazor, NHibernate, Episerver, NServiceBus, GraphQL, REST</w:t>
       </w:r>
     </w:p>
     <w:p>
@@ -259,813 +744,182 @@
           <w:b/>
           <w:bCs/>
         </w:rPr>
-        <w:t xml:space="preserve">Customers:</w:t>
-      </w:r>
-      <w:r>
-        <w:t xml:space="preserve"> </w:t>
-      </w:r>
-      <w:r>
-        <w:t xml:space="preserve">Skatteetaten, Helsedirektoratet</w:t>
-      </w:r>
-    </w:p>
-    <w:bookmarkEnd w:id="13"/>
-    <w:bookmarkStart w:id="14" w:name="earlier-positions"/>
-    <w:p>
-      <w:pPr>
-        <w:pStyle w:val="Heading2"/>
-      </w:pPr>
-      <w:r>
-        <w:t xml:space="preserve">Earlier Positions</w:t>
-      </w:r>
-    </w:p>
-    <w:p>
-      <w:pPr>
-        <w:pStyle w:val="Compact"/>
-        <w:numPr>
-          <w:ilvl w:val="0"/>
-          <w:numId w:val="1001"/>
-        </w:numPr>
-      </w:pPr>
-      <w:r>
-        <w:rPr>
-          <w:i/>
-          <w:iCs/>
-        </w:rPr>
-        <w:t xml:space="preserve">03/2014 – 08/2017</w:t>
-      </w:r>
-      <w:r>
-        <w:t xml:space="preserve"> </w:t>
-      </w:r>
-      <w:r>
-        <w:t xml:space="preserve">—</w:t>
-      </w:r>
-      <w:r>
-        <w:t xml:space="preserve"> </w:t>
-      </w:r>
-      <w:r>
-        <w:rPr>
-          <w:b/>
-          <w:bCs/>
-        </w:rPr>
-        <w:t xml:space="preserve">CGI</w:t>
-      </w:r>
-      <w:r>
-        <w:t xml:space="preserve">, Senior Web Developer</w:t>
-      </w:r>
-    </w:p>
-    <w:p>
-      <w:pPr>
-        <w:pStyle w:val="Compact"/>
-        <w:numPr>
-          <w:ilvl w:val="0"/>
-          <w:numId w:val="1001"/>
-        </w:numPr>
-      </w:pPr>
-      <w:r>
-        <w:rPr>
-          <w:i/>
-          <w:iCs/>
-        </w:rPr>
-        <w:t xml:space="preserve">03/2010 – 01/2014</w:t>
-      </w:r>
-      <w:r>
-        <w:t xml:space="preserve"> </w:t>
-      </w:r>
-      <w:r>
-        <w:t xml:space="preserve">—</w:t>
-      </w:r>
-      <w:r>
-        <w:t xml:space="preserve"> </w:t>
-      </w:r>
-      <w:r>
-        <w:rPr>
-          <w:b/>
-          <w:bCs/>
-        </w:rPr>
-        <w:t xml:space="preserve">Making Waves</w:t>
-      </w:r>
-      <w:r>
-        <w:t xml:space="preserve">, Senior Systems Consultant</w:t>
-      </w:r>
-    </w:p>
-    <w:p>
-      <w:pPr>
-        <w:pStyle w:val="Compact"/>
-        <w:numPr>
-          <w:ilvl w:val="0"/>
-          <w:numId w:val="1001"/>
-        </w:numPr>
-      </w:pPr>
-      <w:r>
-        <w:rPr>
-          <w:i/>
-          <w:iCs/>
-        </w:rPr>
-        <w:t xml:space="preserve">08/2008 – 12/2009</w:t>
-      </w:r>
-      <w:r>
-        <w:t xml:space="preserve"> </w:t>
-      </w:r>
-      <w:r>
-        <w:t xml:space="preserve">—</w:t>
-      </w:r>
-      <w:r>
-        <w:t xml:space="preserve"> </w:t>
-      </w:r>
-      <w:r>
-        <w:rPr>
-          <w:b/>
-          <w:bCs/>
-        </w:rPr>
-        <w:t xml:space="preserve">Creuna</w:t>
-      </w:r>
-      <w:r>
-        <w:t xml:space="preserve">, Consultant / Systems Developer</w:t>
-      </w:r>
-    </w:p>
-    <w:p>
-      <w:pPr>
-        <w:pStyle w:val="Compact"/>
-        <w:numPr>
-          <w:ilvl w:val="0"/>
-          <w:numId w:val="1001"/>
-        </w:numPr>
-      </w:pPr>
-      <w:r>
-        <w:rPr>
-          <w:i/>
-          <w:iCs/>
-        </w:rPr>
-        <w:t xml:space="preserve">02/2006 – 07/2008</w:t>
-      </w:r>
-      <w:r>
-        <w:t xml:space="preserve"> </w:t>
-      </w:r>
-      <w:r>
-        <w:t xml:space="preserve">—</w:t>
-      </w:r>
-      <w:r>
-        <w:t xml:space="preserve"> </w:t>
-      </w:r>
-      <w:r>
-        <w:rPr>
-          <w:b/>
-          <w:bCs/>
-        </w:rPr>
-        <w:t xml:space="preserve">Ocelluz</w:t>
-      </w:r>
-      <w:r>
-        <w:t xml:space="preserve">, Systems Developer &amp; Project Manager</w:t>
-      </w:r>
-    </w:p>
-    <w:p>
-      <w:pPr>
-        <w:pStyle w:val="Compact"/>
-        <w:numPr>
-          <w:ilvl w:val="0"/>
-          <w:numId w:val="1001"/>
-        </w:numPr>
-      </w:pPr>
-      <w:r>
-        <w:rPr>
-          <w:i/>
-          <w:iCs/>
-        </w:rPr>
-        <w:t xml:space="preserve">10/2004 – 02/2008</w:t>
-      </w:r>
-      <w:r>
-        <w:t xml:space="preserve"> </w:t>
-      </w:r>
-      <w:r>
-        <w:t xml:space="preserve">—</w:t>
-      </w:r>
-      <w:r>
-        <w:t xml:space="preserve"> </w:t>
-      </w:r>
-      <w:r>
-        <w:rPr>
-          <w:b/>
-          <w:bCs/>
-        </w:rPr>
-        <w:t xml:space="preserve">Anders Nordby Konsulenttjenester</w:t>
-      </w:r>
-    </w:p>
-    <w:p>
-      <w:pPr>
-        <w:pStyle w:val="Compact"/>
-        <w:numPr>
-          <w:ilvl w:val="0"/>
-          <w:numId w:val="1001"/>
-        </w:numPr>
-      </w:pPr>
-      <w:r>
-        <w:rPr>
-          <w:i/>
-          <w:iCs/>
-        </w:rPr>
-        <w:t xml:space="preserve">05/1995 – 06/2002</w:t>
-      </w:r>
-      <w:r>
-        <w:t xml:space="preserve"> </w:t>
-      </w:r>
-      <w:r>
-        <w:t xml:space="preserve">—</w:t>
-      </w:r>
-      <w:r>
-        <w:t xml:space="preserve"> </w:t>
-      </w:r>
-      <w:r>
-        <w:rPr>
-          <w:b/>
-          <w:bCs/>
-        </w:rPr>
-        <w:t xml:space="preserve">Ajilon</w:t>
-      </w:r>
-      <w:r>
-        <w:t xml:space="preserve">, Consultant</w:t>
-      </w:r>
-    </w:p>
-    <w:bookmarkEnd w:id="14"/>
-    <w:bookmarkEnd w:id="15"/>
-    <w:bookmarkStart w:id="16" w:name="education"/>
+        <w:t xml:space="preserve">Cloud &amp; DevOps:</w:t>
+      </w:r>
+      <w:r>
+        <w:t xml:space="preserve"> </w:t>
+      </w:r>
+      <w:r>
+        <w:t xml:space="preserve">Azure, TeamCity, Octopus Deploy, Git</w:t>
+      </w:r>
+    </w:p>
+    <w:p>
+      <w:pPr>
+        <w:pStyle w:val="BodyText"/>
+      </w:pPr>
+      <w:r>
+        <w:rPr>
+          <w:b/>
+          <w:bCs/>
+        </w:rPr>
+        <w:t xml:space="preserve">Testing:</w:t>
+      </w:r>
+      <w:r>
+        <w:t xml:space="preserve"> </w:t>
+      </w:r>
+      <w:r>
+        <w:t xml:space="preserve">NUnit, SpecFlow, jMeter, BlazeMeter</w:t>
+      </w:r>
+    </w:p>
+    <w:p>
+      <w:pPr>
+        <w:pStyle w:val="BodyText"/>
+      </w:pPr>
+      <w:r>
+        <w:rPr>
+          <w:b/>
+          <w:bCs/>
+        </w:rPr>
+        <w:t xml:space="preserve">Security:</w:t>
+      </w:r>
+      <w:r>
+        <w:t xml:space="preserve"> </w:t>
+      </w:r>
+      <w:r>
+        <w:t xml:space="preserve">Kiuwan</w:t>
+      </w:r>
+    </w:p>
+    <w:p>
+      <w:pPr>
+        <w:pStyle w:val="BodyText"/>
+      </w:pPr>
+      <w:r>
+        <w:rPr>
+          <w:b/>
+          <w:bCs/>
+        </w:rPr>
+        <w:t xml:space="preserve">Collaboration:</w:t>
+      </w:r>
+      <w:r>
+        <w:t xml:space="preserve"> </w:t>
+      </w:r>
+      <w:r>
+        <w:t xml:space="preserve">Jira, Confluence</w:t>
+      </w:r>
+    </w:p>
+    <w:p>
+      <w:pPr>
+        <w:pStyle w:val="BodyText"/>
+      </w:pPr>
+      <w:r>
+        <w:rPr>
+          <w:b/>
+          <w:bCs/>
+        </w:rPr>
+        <w:t xml:space="preserve">Methodologies:</w:t>
+      </w:r>
+      <w:r>
+        <w:t xml:space="preserve"> </w:t>
+      </w:r>
+      <w:r>
+        <w:t xml:space="preserve">Systems Architecture, Agile, Scrum, Kanban, Project Management</w:t>
+      </w:r>
+    </w:p>
+    <w:p>
+      <w:pPr>
+        <w:pStyle w:val="BodyText"/>
+      </w:pPr>
+      <w:r>
+        <w:rPr>
+          <w:b/>
+          <w:bCs/>
+        </w:rPr>
+        <w:t xml:space="preserve">Other Tools:</w:t>
+      </w:r>
+      <w:r>
+        <w:t xml:space="preserve"> </w:t>
+      </w:r>
+      <w:r>
+        <w:t xml:space="preserve">LaTeX</w:t>
+      </w:r>
+    </w:p>
+    <w:bookmarkEnd w:id="19"/>
+    <w:bookmarkStart w:id="20" w:name="languages"/>
     <w:p>
       <w:pPr>
         <w:pStyle w:val="Heading1"/>
       </w:pPr>
       <w:r>
-        <w:t xml:space="preserve">Education</w:t>
-      </w:r>
-    </w:p>
-    <w:p>
-      <w:pPr>
-        <w:pStyle w:val="Compact"/>
-        <w:numPr>
-          <w:ilvl w:val="0"/>
-          <w:numId w:val="1002"/>
-        </w:numPr>
-      </w:pPr>
-      <w:r>
-        <w:rPr>
-          <w:i/>
-          <w:iCs/>
-        </w:rPr>
-        <w:t xml:space="preserve">Current</w:t>
-      </w:r>
-      <w:r>
-        <w:t xml:space="preserve"> </w:t>
-      </w:r>
-      <w:r>
-        <w:t xml:space="preserve">—</w:t>
-      </w:r>
-      <w:r>
-        <w:t xml:space="preserve"> </w:t>
-      </w:r>
-      <w:r>
-        <w:rPr>
-          <w:b/>
-          <w:bCs/>
-        </w:rPr>
-        <w:t xml:space="preserve">Kristiania University of Applied Sciences</w:t>
-      </w:r>
-      <w:r>
-        <w:t xml:space="preserve">, Cloud Security</w:t>
-      </w:r>
-    </w:p>
-    <w:p>
-      <w:pPr>
-        <w:pStyle w:val="Compact"/>
-        <w:numPr>
-          <w:ilvl w:val="0"/>
-          <w:numId w:val="1002"/>
-        </w:numPr>
-      </w:pPr>
-      <w:r>
-        <w:rPr>
-          <w:i/>
-          <w:iCs/>
-        </w:rPr>
-        <w:t xml:space="preserve">2003 – 2004</w:t>
-      </w:r>
-      <w:r>
-        <w:t xml:space="preserve"> </w:t>
-      </w:r>
-      <w:r>
-        <w:t xml:space="preserve">—</w:t>
-      </w:r>
-      <w:r>
-        <w:t xml:space="preserve"> </w:t>
-      </w:r>
-      <w:r>
-        <w:rPr>
-          <w:b/>
-          <w:bCs/>
-        </w:rPr>
-        <w:t xml:space="preserve">University of Oslo</w:t>
-      </w:r>
-      <w:r>
-        <w:t xml:space="preserve">, Teacher Training</w:t>
-      </w:r>
-    </w:p>
-    <w:p>
-      <w:pPr>
-        <w:pStyle w:val="Compact"/>
-        <w:numPr>
-          <w:ilvl w:val="0"/>
-          <w:numId w:val="1002"/>
-        </w:numPr>
-      </w:pPr>
-      <w:r>
-        <w:rPr>
-          <w:i/>
-          <w:iCs/>
-        </w:rPr>
-        <w:t xml:space="preserve">1999 – 2000</w:t>
-      </w:r>
-      <w:r>
-        <w:t xml:space="preserve"> </w:t>
-      </w:r>
-      <w:r>
-        <w:t xml:space="preserve">—</w:t>
-      </w:r>
-      <w:r>
-        <w:t xml:space="preserve"> </w:t>
-      </w:r>
-      <w:r>
-        <w:rPr>
-          <w:b/>
-          <w:bCs/>
-        </w:rPr>
-        <w:t xml:space="preserve">Oslo Business Academy</w:t>
-      </w:r>
-      <w:r>
-        <w:t xml:space="preserve">, IT Candidate</w:t>
-      </w:r>
-    </w:p>
-    <w:p>
-      <w:pPr>
-        <w:pStyle w:val="Compact"/>
-        <w:numPr>
-          <w:ilvl w:val="0"/>
-          <w:numId w:val="1002"/>
-        </w:numPr>
-      </w:pPr>
-      <w:r>
-        <w:rPr>
-          <w:i/>
-          <w:iCs/>
-        </w:rPr>
-        <w:t xml:space="preserve">1987 – 1996</w:t>
-      </w:r>
-      <w:r>
-        <w:t xml:space="preserve"> </w:t>
-      </w:r>
-      <w:r>
-        <w:t xml:space="preserve">—</w:t>
-      </w:r>
-      <w:r>
-        <w:t xml:space="preserve"> </w:t>
-      </w:r>
-      <w:r>
-        <w:rPr>
-          <w:b/>
-          <w:bCs/>
-        </w:rPr>
-        <w:t xml:space="preserve">University of Oslo</w:t>
-      </w:r>
-      <w:r>
-        <w:t xml:space="preserve">, Cand.Mag.</w:t>
-      </w:r>
-    </w:p>
-    <w:p>
-      <w:pPr>
-        <w:pStyle w:val="Compact"/>
-        <w:numPr>
-          <w:ilvl w:val="0"/>
-          <w:numId w:val="1002"/>
-        </w:numPr>
-      </w:pPr>
-      <w:r>
-        <w:rPr>
-          <w:i/>
-          <w:iCs/>
-        </w:rPr>
-        <w:t xml:space="preserve">1984 – 1987</w:t>
-      </w:r>
-      <w:r>
-        <w:t xml:space="preserve"> </w:t>
-      </w:r>
-      <w:r>
-        <w:t xml:space="preserve">—</w:t>
-      </w:r>
-      <w:r>
-        <w:t xml:space="preserve"> </w:t>
-      </w:r>
-      <w:r>
-        <w:rPr>
-          <w:b/>
-          <w:bCs/>
-        </w:rPr>
-        <w:t xml:space="preserve">Eikeli High School</w:t>
-      </w:r>
-      <w:r>
-        <w:t xml:space="preserve">, Natural Sciences</w:t>
-      </w:r>
-    </w:p>
-    <w:bookmarkEnd w:id="16"/>
-    <w:bookmarkStart w:id="17" w:name="certifications"/>
-    <w:p>
-      <w:pPr>
-        <w:pStyle w:val="Heading1"/>
-      </w:pPr>
-      <w:r>
-        <w:t xml:space="preserve">Certifications</w:t>
-      </w:r>
-    </w:p>
-    <w:p>
-      <w:pPr>
-        <w:pStyle w:val="Compact"/>
-        <w:numPr>
-          <w:ilvl w:val="0"/>
-          <w:numId w:val="1003"/>
-        </w:numPr>
-      </w:pPr>
-      <w:r>
-        <w:rPr>
-          <w:i/>
-          <w:iCs/>
-        </w:rPr>
-        <w:t xml:space="preserve">2025</w:t>
-      </w:r>
-      <w:r>
-        <w:t xml:space="preserve"> </w:t>
-      </w:r>
-      <w:r>
-        <w:t xml:space="preserve">— Goethe-Zertifikat Deutsch B2</w:t>
-      </w:r>
-    </w:p>
-    <w:p>
-      <w:pPr>
-        <w:pStyle w:val="Compact"/>
-        <w:numPr>
-          <w:ilvl w:val="0"/>
-          <w:numId w:val="1003"/>
-        </w:numPr>
-      </w:pPr>
-      <w:r>
-        <w:rPr>
-          <w:i/>
-          <w:iCs/>
-        </w:rPr>
-        <w:t xml:space="preserve">2025</w:t>
-      </w:r>
-      <w:r>
-        <w:t xml:space="preserve"> </w:t>
-      </w:r>
-      <w:r>
-        <w:t xml:space="preserve">— SecureFlag: Secure Coding</w:t>
-      </w:r>
-    </w:p>
-    <w:p>
-      <w:pPr>
-        <w:pStyle w:val="Compact"/>
-        <w:numPr>
-          <w:ilvl w:val="0"/>
-          <w:numId w:val="1003"/>
-        </w:numPr>
-      </w:pPr>
-      <w:r>
-        <w:rPr>
-          <w:i/>
-          <w:iCs/>
-        </w:rPr>
-        <w:t xml:space="preserve">2021</w:t>
-      </w:r>
-      <w:r>
-        <w:t xml:space="preserve"> </w:t>
-      </w:r>
-      <w:r>
-        <w:t xml:space="preserve">— Certified Optimizely Developer</w:t>
-      </w:r>
-    </w:p>
-    <w:p>
-      <w:pPr>
-        <w:pStyle w:val="Compact"/>
-        <w:numPr>
-          <w:ilvl w:val="0"/>
-          <w:numId w:val="1003"/>
-        </w:numPr>
-      </w:pPr>
-      <w:r>
-        <w:rPr>
-          <w:i/>
-          <w:iCs/>
-        </w:rPr>
-        <w:t xml:space="preserve">2020</w:t>
-      </w:r>
-      <w:r>
-        <w:t xml:space="preserve"> </w:t>
-      </w:r>
-      <w:r>
-        <w:t xml:space="preserve">— Microsoft AZ900 Azure Fundamentals</w:t>
-      </w:r>
-    </w:p>
-    <w:p>
-      <w:pPr>
-        <w:pStyle w:val="Compact"/>
-        <w:numPr>
-          <w:ilvl w:val="0"/>
-          <w:numId w:val="1003"/>
-        </w:numPr>
-      </w:pPr>
-      <w:r>
-        <w:rPr>
-          <w:i/>
-          <w:iCs/>
-        </w:rPr>
-        <w:t xml:space="preserve">2018-2019</w:t>
-      </w:r>
-      <w:r>
-        <w:t xml:space="preserve"> </w:t>
-      </w:r>
-      <w:r>
-        <w:t xml:space="preserve">— PRINCE2 Foundation &amp; Practitioner</w:t>
-      </w:r>
-    </w:p>
-    <w:p>
-      <w:pPr>
-        <w:pStyle w:val="Compact"/>
-        <w:numPr>
-          <w:ilvl w:val="0"/>
-          <w:numId w:val="1003"/>
-        </w:numPr>
-      </w:pPr>
-      <w:r>
-        <w:rPr>
-          <w:i/>
-          <w:iCs/>
-        </w:rPr>
-        <w:t xml:space="preserve">2019</w:t>
-      </w:r>
-      <w:r>
-        <w:t xml:space="preserve"> </w:t>
-      </w:r>
-      <w:r>
-        <w:t xml:space="preserve">— Certified Scrum Master</w:t>
-      </w:r>
-    </w:p>
-    <w:bookmarkEnd w:id="17"/>
-    <w:bookmarkStart w:id="18" w:name="courses"/>
-    <w:p>
-      <w:pPr>
-        <w:pStyle w:val="Heading1"/>
-      </w:pPr>
-      <w:r>
-        <w:t xml:space="preserve">Courses</w:t>
-      </w:r>
-    </w:p>
-    <w:p>
-      <w:pPr>
-        <w:pStyle w:val="Compact"/>
-        <w:numPr>
-          <w:ilvl w:val="0"/>
-          <w:numId w:val="1004"/>
-        </w:numPr>
-      </w:pPr>
-      <w:r>
-        <w:rPr>
-          <w:i/>
-          <w:iCs/>
-        </w:rPr>
-        <w:t xml:space="preserve">2024</w:t>
-      </w:r>
-      <w:r>
-        <w:t xml:space="preserve"> </w:t>
-      </w:r>
-      <w:r>
-        <w:t xml:space="preserve">— Building an AppSec Scanning Programme</w:t>
-      </w:r>
-    </w:p>
-    <w:p>
-      <w:pPr>
-        <w:pStyle w:val="Compact"/>
-        <w:numPr>
-          <w:ilvl w:val="0"/>
-          <w:numId w:val="1004"/>
-        </w:numPr>
-      </w:pPr>
-      <w:r>
-        <w:rPr>
-          <w:i/>
-          <w:iCs/>
-        </w:rPr>
-        <w:t xml:space="preserve">2019</w:t>
-      </w:r>
-      <w:r>
-        <w:t xml:space="preserve"> </w:t>
-      </w:r>
-      <w:r>
-        <w:t xml:space="preserve">— Tom Gilb: Architecture Workshop</w:t>
-      </w:r>
-    </w:p>
-    <w:p>
-      <w:pPr>
-        <w:pStyle w:val="Compact"/>
-        <w:numPr>
-          <w:ilvl w:val="0"/>
-          <w:numId w:val="1004"/>
-        </w:numPr>
-      </w:pPr>
-      <w:r>
-        <w:rPr>
-          <w:i/>
-          <w:iCs/>
-        </w:rPr>
-        <w:t xml:space="preserve">2018</w:t>
-      </w:r>
-      <w:r>
-        <w:t xml:space="preserve"> </w:t>
-      </w:r>
-      <w:r>
-        <w:t xml:space="preserve">— Sopra Steria: Software Architecture School</w:t>
-      </w:r>
-    </w:p>
-    <w:p>
-      <w:pPr>
-        <w:pStyle w:val="Compact"/>
-        <w:numPr>
-          <w:ilvl w:val="0"/>
-          <w:numId w:val="1004"/>
-        </w:numPr>
-      </w:pPr>
-      <w:r>
-        <w:rPr>
-          <w:i/>
-          <w:iCs/>
-        </w:rPr>
-        <w:t xml:space="preserve">2015</w:t>
-      </w:r>
-      <w:r>
-        <w:t xml:space="preserve"> </w:t>
-      </w:r>
-      <w:r>
-        <w:t xml:space="preserve">— Microsoft: Lead Enterprise Architect Programme</w:t>
-      </w:r>
-    </w:p>
-    <w:bookmarkEnd w:id="18"/>
-    <w:bookmarkStart w:id="19" w:name="awards"/>
-    <w:p>
-      <w:pPr>
-        <w:pStyle w:val="Heading1"/>
-      </w:pPr>
-      <w:r>
-        <w:t xml:space="preserve">Awards</w:t>
-      </w:r>
-    </w:p>
-    <w:p>
-      <w:pPr>
-        <w:pStyle w:val="Compact"/>
-        <w:numPr>
-          <w:ilvl w:val="0"/>
-          <w:numId w:val="1005"/>
-        </w:numPr>
-      </w:pPr>
-      <w:r>
-        <w:rPr>
-          <w:i/>
-          <w:iCs/>
-        </w:rPr>
-        <w:t xml:space="preserve">2013-2017</w:t>
-      </w:r>
-      <w:r>
-        <w:t xml:space="preserve"> </w:t>
-      </w:r>
-      <w:r>
-        <w:t xml:space="preserve">— Episerver Most Valued Professional</w:t>
-      </w:r>
-    </w:p>
-    <w:bookmarkEnd w:id="19"/>
-    <w:bookmarkStart w:id="20" w:name="skills"/>
-    <w:p>
-      <w:pPr>
-        <w:pStyle w:val="Heading1"/>
-      </w:pPr>
-      <w:r>
-        <w:t xml:space="preserve">Skills</w:t>
-      </w:r>
-    </w:p>
-    <w:p>
-      <w:pPr>
-        <w:pStyle w:val="FirstParagraph"/>
-      </w:pPr>
-      <w:r>
-        <w:rPr>
-          <w:b/>
-          <w:bCs/>
-        </w:rPr>
-        <w:t xml:space="preserve">Processes:</w:t>
-      </w:r>
-      <w:r>
-        <w:t xml:space="preserve"> </w:t>
-      </w:r>
-      <w:r>
-        <w:t xml:space="preserve">Systems Architecture, Scrum, Kanban, Project Management</w:t>
-      </w:r>
-    </w:p>
-    <w:p>
-      <w:pPr>
-        <w:pStyle w:val="BodyText"/>
-      </w:pPr>
-      <w:r>
-        <w:rPr>
-          <w:b/>
-          <w:bCs/>
-        </w:rPr>
-        <w:t xml:space="preserve">Technology:</w:t>
-      </w:r>
-      <w:r>
-        <w:t xml:space="preserve"> </w:t>
-      </w:r>
-      <w:r>
-        <w:t xml:space="preserve">C#, Akka.Net, GraphQL, NHibernate, Blazor, Specflow, NUnit, Episerver, ASP.Net, SQL, Javascript, NServiceBus, REST, Powershell, Jira, Confluence, TeamCity, Octopus Deploy, Git, jMeter, BlazeMeter, Kiuwan, LaTeX</w:t>
+        <w:t xml:space="preserve">Languages</w:t>
+      </w:r>
+    </w:p>
+    <w:p>
+      <w:pPr>
+        <w:pStyle w:val="Compact"/>
+        <w:numPr>
+          <w:ilvl w:val="0"/>
+          <w:numId w:val="1006"/>
+        </w:numPr>
+      </w:pPr>
+      <w:r>
+        <w:rPr>
+          <w:b/>
+          <w:bCs/>
+        </w:rPr>
+        <w:t xml:space="preserve">Professional:</w:t>
+      </w:r>
+      <w:r>
+        <w:t xml:space="preserve"> </w:t>
+      </w:r>
+      <w:r>
+        <w:t xml:space="preserve">Norwegian (native), English</w:t>
+      </w:r>
+    </w:p>
+    <w:p>
+      <w:pPr>
+        <w:pStyle w:val="Compact"/>
+        <w:numPr>
+          <w:ilvl w:val="0"/>
+          <w:numId w:val="1006"/>
+        </w:numPr>
+      </w:pPr>
+      <w:r>
+        <w:rPr>
+          <w:b/>
+          <w:bCs/>
+        </w:rPr>
+        <w:t xml:space="preserve">Conversational:</w:t>
+      </w:r>
+      <w:r>
+        <w:t xml:space="preserve"> </w:t>
+      </w:r>
+      <w:r>
+        <w:t xml:space="preserve">German (B2), Bulgarian</w:t>
+      </w:r>
+    </w:p>
+    <w:p>
+      <w:pPr>
+        <w:pStyle w:val="Compact"/>
+        <w:numPr>
+          <w:ilvl w:val="0"/>
+          <w:numId w:val="1006"/>
+        </w:numPr>
+      </w:pPr>
+      <w:r>
+        <w:rPr>
+          <w:b/>
+          <w:bCs/>
+        </w:rPr>
+        <w:t xml:space="preserve">Beginner:</w:t>
+      </w:r>
+      <w:r>
+        <w:t xml:space="preserve"> </w:t>
+      </w:r>
+      <w:r>
+        <w:t xml:space="preserve">Spanish, Catalan, Japanese</w:t>
       </w:r>
     </w:p>
     <w:bookmarkEnd w:id="20"/>
-    <w:bookmarkStart w:id="21" w:name="languages"/>
-    <w:p>
-      <w:pPr>
-        <w:pStyle w:val="Heading1"/>
-      </w:pPr>
-      <w:r>
-        <w:t xml:space="preserve">Languages</w:t>
-      </w:r>
-    </w:p>
-    <w:p>
-      <w:pPr>
-        <w:pStyle w:val="Compact"/>
-        <w:numPr>
-          <w:ilvl w:val="0"/>
-          <w:numId w:val="1006"/>
-        </w:numPr>
-      </w:pPr>
-      <w:r>
-        <w:rPr>
-          <w:b/>
-          <w:bCs/>
-        </w:rPr>
-        <w:t xml:space="preserve">Professional:</w:t>
-      </w:r>
-      <w:r>
-        <w:t xml:space="preserve"> </w:t>
-      </w:r>
-      <w:r>
-        <w:t xml:space="preserve">Norwegian (native), English</w:t>
-      </w:r>
-    </w:p>
-    <w:p>
-      <w:pPr>
-        <w:pStyle w:val="Compact"/>
-        <w:numPr>
-          <w:ilvl w:val="0"/>
-          <w:numId w:val="1006"/>
-        </w:numPr>
-      </w:pPr>
-      <w:r>
-        <w:rPr>
-          <w:b/>
-          <w:bCs/>
-        </w:rPr>
-        <w:t xml:space="preserve">Conversational:</w:t>
-      </w:r>
-      <w:r>
-        <w:t xml:space="preserve"> </w:t>
-      </w:r>
-      <w:r>
-        <w:t xml:space="preserve">German (B2), Bulgarian</w:t>
-      </w:r>
-    </w:p>
-    <w:p>
-      <w:pPr>
-        <w:pStyle w:val="Compact"/>
-        <w:numPr>
-          <w:ilvl w:val="0"/>
-          <w:numId w:val="1006"/>
-        </w:numPr>
-      </w:pPr>
-      <w:r>
-        <w:rPr>
-          <w:b/>
-          <w:bCs/>
-        </w:rPr>
-        <w:t xml:space="preserve">Beginner:</w:t>
-      </w:r>
-      <w:r>
-        <w:t xml:space="preserve"> </w:t>
-      </w:r>
-      <w:r>
-        <w:t xml:space="preserve">Spanish, Catalan, Japanese</w:t>
-      </w:r>
-    </w:p>
-    <w:bookmarkEnd w:id="21"/>
     <w:sectPr>
       <w:footnotePr>
         <w:numRestart w:val="eachSect"/>

</xml_diff>

<commit_message>
publish: balanced one-page Freeman + modernized ATS template
</commit_message>
<xml_diff>
--- a/CV_Anders_G_Nordby_EN/CV_Anders_G_Nordby_EN_ATS.docx
+++ b/CV_Anders_G_Nordby_EN/CV_Anders_G_Nordby_EN_ATS.docx
@@ -56,7 +56,7 @@
       </w:r>
     </w:p>
     <w:bookmarkEnd w:id="10"/>
-    <w:bookmarkStart w:id="14" w:name="work-experience"/>
+    <w:bookmarkStart w:id="13" w:name="work-experience"/>
     <w:p>
       <w:pPr>
         <w:pStyle w:val="Heading1"/>
@@ -115,6 +115,12 @@
       <w:r>
         <w:t xml:space="preserve">C#, .NET Core, GitLab, YouTrack, Powershell</w:t>
       </w:r>
+      <w:r>
+        <w:t xml:space="preserve"> </w:t>
+      </w:r>
+      <w:r>
+        <w:t xml:space="preserve">3-month senior-developer engagement at GEBHARDT Fördertechnik (German materials-handling automation), delivering C# / .NET Core features within their existing GitLab + YouTrack workflow.</w:t>
+      </w:r>
     </w:p>
     <w:p>
       <w:pPr>
@@ -153,7 +159,7 @@
         <w:t xml:space="preserve"> </w:t>
       </w:r>
       <w:r>
-        <w:t xml:space="preserve">Senior developer on Element Logic’s main product, eManager. Additionally, focuses on application security, and is the initiator and leader for Element Logic’s Security Chapions Guild.</w:t>
+        <w:t xml:space="preserve">Senior developer on eManager — Element Logic’s flagship warehouse-automation platform — across more than five years. Delivered features in C# / Akka.NET / Blazor across REST and GraphQL APIs. Initiated and lead Element Logic’s Security Champions Guild — the company’s internal security-governance program — driving secure-coding practices across the development organization.</w:t>
       </w:r>
     </w:p>
     <w:p>
@@ -189,15 +195,501 @@
       <w:r>
         <w:t xml:space="preserve">Azure DevOps, Azure DB, Azure WebServices, Akka.NET, TypeScript, React JS, C#, Microsoft .NET Core, TFS, Git, Powershell</w:t>
       </w:r>
+      <w:r>
+        <w:t xml:space="preserve"> </w:t>
+      </w:r>
+      <w:r>
+        <w:t xml:space="preserve">6-month senior-developer engagement at ABB on a cloud-native stack: Azure DevOps, Azure DB / WebServices, .NET Core, React / TypeScript, Akka.NET.</w:t>
+      </w:r>
     </w:p>
     <w:bookmarkEnd w:id="11"/>
-    <w:bookmarkStart w:id="12" w:name="lead-software-engineer-sopra-steria"/>
+    <w:bookmarkStart w:id="12" w:name="earlier-positions"/>
     <w:p>
       <w:pPr>
         <w:pStyle w:val="Heading2"/>
       </w:pPr>
       <w:r>
-        <w:t xml:space="preserve">Lead Software Engineer — Sopra Steria</w:t>
+        <w:t xml:space="preserve">Earlier Positions</w:t>
+      </w:r>
+    </w:p>
+    <w:p>
+      <w:pPr>
+        <w:pStyle w:val="Compact"/>
+        <w:numPr>
+          <w:ilvl w:val="0"/>
+          <w:numId w:val="1001"/>
+        </w:numPr>
+      </w:pPr>
+      <w:r>
+        <w:t xml:space="preserve">01/2018 – 04/2019 —</w:t>
+      </w:r>
+      <w:r>
+        <w:t xml:space="preserve"> </w:t>
+      </w:r>
+      <w:r>
+        <w:rPr>
+          <w:b/>
+          <w:bCs/>
+        </w:rPr>
+        <w:t xml:space="preserve">Sopra Steria</w:t>
+      </w:r>
+      <w:r>
+        <w:t xml:space="preserve">, Lead Software Engineer</w:t>
+      </w:r>
+    </w:p>
+    <w:p>
+      <w:pPr>
+        <w:pStyle w:val="Compact"/>
+        <w:numPr>
+          <w:ilvl w:val="0"/>
+          <w:numId w:val="1001"/>
+        </w:numPr>
+      </w:pPr>
+      <w:r>
+        <w:t xml:space="preserve">03/2014 – 08/2017 —</w:t>
+      </w:r>
+      <w:r>
+        <w:t xml:space="preserve"> </w:t>
+      </w:r>
+      <w:r>
+        <w:rPr>
+          <w:b/>
+          <w:bCs/>
+        </w:rPr>
+        <w:t xml:space="preserve">CGI</w:t>
+      </w:r>
+      <w:r>
+        <w:t xml:space="preserve">, Senior Web Developer</w:t>
+      </w:r>
+    </w:p>
+    <w:p>
+      <w:pPr>
+        <w:pStyle w:val="Compact"/>
+        <w:numPr>
+          <w:ilvl w:val="0"/>
+          <w:numId w:val="1001"/>
+        </w:numPr>
+      </w:pPr>
+      <w:r>
+        <w:t xml:space="preserve">03/2010 – 01/2014 —</w:t>
+      </w:r>
+      <w:r>
+        <w:t xml:space="preserve"> </w:t>
+      </w:r>
+      <w:r>
+        <w:rPr>
+          <w:b/>
+          <w:bCs/>
+        </w:rPr>
+        <w:t xml:space="preserve">Making Waves</w:t>
+      </w:r>
+      <w:r>
+        <w:t xml:space="preserve">, Senior Systems Consultant</w:t>
+      </w:r>
+    </w:p>
+    <w:p>
+      <w:pPr>
+        <w:pStyle w:val="Compact"/>
+        <w:numPr>
+          <w:ilvl w:val="0"/>
+          <w:numId w:val="1001"/>
+        </w:numPr>
+      </w:pPr>
+      <w:r>
+        <w:t xml:space="preserve">08/2008 – 12/2009 —</w:t>
+      </w:r>
+      <w:r>
+        <w:t xml:space="preserve"> </w:t>
+      </w:r>
+      <w:r>
+        <w:rPr>
+          <w:b/>
+          <w:bCs/>
+        </w:rPr>
+        <w:t xml:space="preserve">Creuna</w:t>
+      </w:r>
+      <w:r>
+        <w:t xml:space="preserve">, Consultant / Systems Developer</w:t>
+      </w:r>
+    </w:p>
+    <w:p>
+      <w:pPr>
+        <w:pStyle w:val="Compact"/>
+        <w:numPr>
+          <w:ilvl w:val="0"/>
+          <w:numId w:val="1001"/>
+        </w:numPr>
+      </w:pPr>
+      <w:r>
+        <w:t xml:space="preserve">02/2006 – 07/2008 —</w:t>
+      </w:r>
+      <w:r>
+        <w:t xml:space="preserve"> </w:t>
+      </w:r>
+      <w:r>
+        <w:rPr>
+          <w:b/>
+          <w:bCs/>
+        </w:rPr>
+        <w:t xml:space="preserve">Ocelluz</w:t>
+      </w:r>
+      <w:r>
+        <w:t xml:space="preserve">, Systems Developer &amp; Project Manager</w:t>
+      </w:r>
+    </w:p>
+    <w:p>
+      <w:pPr>
+        <w:pStyle w:val="Compact"/>
+        <w:numPr>
+          <w:ilvl w:val="0"/>
+          <w:numId w:val="1001"/>
+        </w:numPr>
+      </w:pPr>
+      <w:r>
+        <w:t xml:space="preserve">10/2004 – 02/2008 —</w:t>
+      </w:r>
+      <w:r>
+        <w:t xml:space="preserve"> </w:t>
+      </w:r>
+      <w:r>
+        <w:rPr>
+          <w:b/>
+          <w:bCs/>
+        </w:rPr>
+        <w:t xml:space="preserve">Anders Nordby Konsulenttjenester</w:t>
+      </w:r>
+    </w:p>
+    <w:p>
+      <w:pPr>
+        <w:pStyle w:val="Compact"/>
+        <w:numPr>
+          <w:ilvl w:val="0"/>
+          <w:numId w:val="1001"/>
+        </w:numPr>
+      </w:pPr>
+      <w:r>
+        <w:t xml:space="preserve">05/1995 – 06/2002 —</w:t>
+      </w:r>
+      <w:r>
+        <w:t xml:space="preserve"> </w:t>
+      </w:r>
+      <w:r>
+        <w:rPr>
+          <w:b/>
+          <w:bCs/>
+        </w:rPr>
+        <w:t xml:space="preserve">Ajilon</w:t>
+      </w:r>
+      <w:r>
+        <w:t xml:space="preserve">, Consultant</w:t>
+      </w:r>
+    </w:p>
+    <w:bookmarkEnd w:id="12"/>
+    <w:bookmarkEnd w:id="13"/>
+    <w:bookmarkStart w:id="14" w:name="education"/>
+    <w:p>
+      <w:pPr>
+        <w:pStyle w:val="Heading1"/>
+      </w:pPr>
+      <w:r>
+        <w:t xml:space="preserve">Education</w:t>
+      </w:r>
+    </w:p>
+    <w:p>
+      <w:pPr>
+        <w:pStyle w:val="Compact"/>
+        <w:numPr>
+          <w:ilvl w:val="0"/>
+          <w:numId w:val="1002"/>
+        </w:numPr>
+      </w:pPr>
+      <w:r>
+        <w:t xml:space="preserve">Current —</w:t>
+      </w:r>
+      <w:r>
+        <w:t xml:space="preserve"> </w:t>
+      </w:r>
+      <w:r>
+        <w:rPr>
+          <w:b/>
+          <w:bCs/>
+        </w:rPr>
+        <w:t xml:space="preserve">Kristiania University of Applied Sciences</w:t>
+      </w:r>
+      <w:r>
+        <w:t xml:space="preserve">, Cloud Security</w:t>
+      </w:r>
+    </w:p>
+    <w:p>
+      <w:pPr>
+        <w:pStyle w:val="Compact"/>
+        <w:numPr>
+          <w:ilvl w:val="0"/>
+          <w:numId w:val="1002"/>
+        </w:numPr>
+      </w:pPr>
+      <w:r>
+        <w:t xml:space="preserve">2003 – 2004 —</w:t>
+      </w:r>
+      <w:r>
+        <w:t xml:space="preserve"> </w:t>
+      </w:r>
+      <w:r>
+        <w:rPr>
+          <w:b/>
+          <w:bCs/>
+        </w:rPr>
+        <w:t xml:space="preserve">University of Oslo</w:t>
+      </w:r>
+      <w:r>
+        <w:t xml:space="preserve">, Teacher Training</w:t>
+      </w:r>
+    </w:p>
+    <w:p>
+      <w:pPr>
+        <w:pStyle w:val="Compact"/>
+        <w:numPr>
+          <w:ilvl w:val="0"/>
+          <w:numId w:val="1002"/>
+        </w:numPr>
+      </w:pPr>
+      <w:r>
+        <w:t xml:space="preserve">1999 – 2000 —</w:t>
+      </w:r>
+      <w:r>
+        <w:t xml:space="preserve"> </w:t>
+      </w:r>
+      <w:r>
+        <w:rPr>
+          <w:b/>
+          <w:bCs/>
+        </w:rPr>
+        <w:t xml:space="preserve">Oslo Business Academy</w:t>
+      </w:r>
+      <w:r>
+        <w:t xml:space="preserve">, IT Candidate</w:t>
+      </w:r>
+    </w:p>
+    <w:p>
+      <w:pPr>
+        <w:pStyle w:val="Compact"/>
+        <w:numPr>
+          <w:ilvl w:val="0"/>
+          <w:numId w:val="1002"/>
+        </w:numPr>
+      </w:pPr>
+      <w:r>
+        <w:t xml:space="preserve">1987 – 1996 —</w:t>
+      </w:r>
+      <w:r>
+        <w:t xml:space="preserve"> </w:t>
+      </w:r>
+      <w:r>
+        <w:rPr>
+          <w:b/>
+          <w:bCs/>
+        </w:rPr>
+        <w:t xml:space="preserve">University of Oslo</w:t>
+      </w:r>
+      <w:r>
+        <w:t xml:space="preserve">, Cand.Mag.</w:t>
+      </w:r>
+    </w:p>
+    <w:p>
+      <w:pPr>
+        <w:pStyle w:val="Compact"/>
+        <w:numPr>
+          <w:ilvl w:val="0"/>
+          <w:numId w:val="1002"/>
+        </w:numPr>
+      </w:pPr>
+      <w:r>
+        <w:t xml:space="preserve">1984 – 1987 —</w:t>
+      </w:r>
+      <w:r>
+        <w:t xml:space="preserve"> </w:t>
+      </w:r>
+      <w:r>
+        <w:rPr>
+          <w:b/>
+          <w:bCs/>
+        </w:rPr>
+        <w:t xml:space="preserve">Eikeli High School</w:t>
+      </w:r>
+      <w:r>
+        <w:t xml:space="preserve">, Natural Sciences</w:t>
+      </w:r>
+    </w:p>
+    <w:bookmarkEnd w:id="14"/>
+    <w:bookmarkStart w:id="15" w:name="certifications"/>
+    <w:p>
+      <w:pPr>
+        <w:pStyle w:val="Heading1"/>
+      </w:pPr>
+      <w:r>
+        <w:t xml:space="preserve">Certifications</w:t>
+      </w:r>
+    </w:p>
+    <w:p>
+      <w:pPr>
+        <w:pStyle w:val="Compact"/>
+        <w:numPr>
+          <w:ilvl w:val="0"/>
+          <w:numId w:val="1003"/>
+        </w:numPr>
+      </w:pPr>
+      <w:r>
+        <w:t xml:space="preserve">2025 — Goethe-Zertifikat Deutsch B2</w:t>
+      </w:r>
+    </w:p>
+    <w:p>
+      <w:pPr>
+        <w:pStyle w:val="Compact"/>
+        <w:numPr>
+          <w:ilvl w:val="0"/>
+          <w:numId w:val="1003"/>
+        </w:numPr>
+      </w:pPr>
+      <w:r>
+        <w:t xml:space="preserve">2025 — SecureFlag: Secure Coding</w:t>
+      </w:r>
+    </w:p>
+    <w:p>
+      <w:pPr>
+        <w:pStyle w:val="Compact"/>
+        <w:numPr>
+          <w:ilvl w:val="0"/>
+          <w:numId w:val="1003"/>
+        </w:numPr>
+      </w:pPr>
+      <w:r>
+        <w:t xml:space="preserve">2021 — Certified Optimizely Developer</w:t>
+      </w:r>
+    </w:p>
+    <w:p>
+      <w:pPr>
+        <w:pStyle w:val="Compact"/>
+        <w:numPr>
+          <w:ilvl w:val="0"/>
+          <w:numId w:val="1003"/>
+        </w:numPr>
+      </w:pPr>
+      <w:r>
+        <w:t xml:space="preserve">2020 — Microsoft AZ900 Azure Fundamentals</w:t>
+      </w:r>
+    </w:p>
+    <w:p>
+      <w:pPr>
+        <w:pStyle w:val="Compact"/>
+        <w:numPr>
+          <w:ilvl w:val="0"/>
+          <w:numId w:val="1003"/>
+        </w:numPr>
+      </w:pPr>
+      <w:r>
+        <w:t xml:space="preserve">2018-2019 — PRINCE2 Foundation &amp; Practitioner</w:t>
+      </w:r>
+    </w:p>
+    <w:p>
+      <w:pPr>
+        <w:pStyle w:val="Compact"/>
+        <w:numPr>
+          <w:ilvl w:val="0"/>
+          <w:numId w:val="1003"/>
+        </w:numPr>
+      </w:pPr>
+      <w:r>
+        <w:t xml:space="preserve">2019 — Certified Scrum Master</w:t>
+      </w:r>
+    </w:p>
+    <w:bookmarkEnd w:id="15"/>
+    <w:bookmarkStart w:id="16" w:name="courses"/>
+    <w:p>
+      <w:pPr>
+        <w:pStyle w:val="Heading1"/>
+      </w:pPr>
+      <w:r>
+        <w:t xml:space="preserve">Courses</w:t>
+      </w:r>
+    </w:p>
+    <w:p>
+      <w:pPr>
+        <w:pStyle w:val="Compact"/>
+        <w:numPr>
+          <w:ilvl w:val="0"/>
+          <w:numId w:val="1004"/>
+        </w:numPr>
+      </w:pPr>
+      <w:r>
+        <w:t xml:space="preserve">2024 — Building an AppSec Scanning Programme</w:t>
+      </w:r>
+    </w:p>
+    <w:p>
+      <w:pPr>
+        <w:pStyle w:val="Compact"/>
+        <w:numPr>
+          <w:ilvl w:val="0"/>
+          <w:numId w:val="1004"/>
+        </w:numPr>
+      </w:pPr>
+      <w:r>
+        <w:t xml:space="preserve">2019 — Tom Gilb: Architecture Workshop</w:t>
+      </w:r>
+    </w:p>
+    <w:p>
+      <w:pPr>
+        <w:pStyle w:val="Compact"/>
+        <w:numPr>
+          <w:ilvl w:val="0"/>
+          <w:numId w:val="1004"/>
+        </w:numPr>
+      </w:pPr>
+      <w:r>
+        <w:t xml:space="preserve">2018 — Sopra Steria: Software Architecture School</w:t>
+      </w:r>
+    </w:p>
+    <w:p>
+      <w:pPr>
+        <w:pStyle w:val="Compact"/>
+        <w:numPr>
+          <w:ilvl w:val="0"/>
+          <w:numId w:val="1004"/>
+        </w:numPr>
+      </w:pPr>
+      <w:r>
+        <w:t xml:space="preserve">2015 — Microsoft: Lead Enterprise Architect Programme</w:t>
+      </w:r>
+    </w:p>
+    <w:bookmarkEnd w:id="16"/>
+    <w:bookmarkStart w:id="17" w:name="awards"/>
+    <w:p>
+      <w:pPr>
+        <w:pStyle w:val="Heading1"/>
+      </w:pPr>
+      <w:r>
+        <w:t xml:space="preserve">Awards</w:t>
+      </w:r>
+    </w:p>
+    <w:p>
+      <w:pPr>
+        <w:pStyle w:val="Compact"/>
+        <w:numPr>
+          <w:ilvl w:val="0"/>
+          <w:numId w:val="1005"/>
+        </w:numPr>
+      </w:pPr>
+      <w:r>
+        <w:t xml:space="preserve">2013-2017 — Episerver Most Valued Professional</w:t>
+      </w:r>
+    </w:p>
+    <w:bookmarkEnd w:id="17"/>
+    <w:bookmarkStart w:id="18" w:name="skills"/>
+    <w:p>
+      <w:pPr>
+        <w:pStyle w:val="Heading1"/>
+      </w:pPr>
+      <w:r>
+        <w:t xml:space="preserve">Skills</w:t>
       </w:r>
     </w:p>
     <w:p>
@@ -205,7 +697,17 @@
         <w:pStyle w:val="FirstParagraph"/>
       </w:pPr>
       <w:r>
-        <w:t xml:space="preserve">01/2018 – 04/2019</w:t>
+        <w:rPr>
+          <w:b/>
+          <w:bCs/>
+        </w:rPr>
+        <w:t xml:space="preserve">Languages:</w:t>
+      </w:r>
+      <w:r>
+        <w:t xml:space="preserve"> </w:t>
+      </w:r>
+      <w:r>
+        <w:t xml:space="preserve">C#, JavaScript, SQL, PowerShell</w:t>
       </w:r>
     </w:p>
     <w:p>
@@ -213,7 +715,17 @@
         <w:pStyle w:val="BodyText"/>
       </w:pPr>
       <w:r>
-        <w:t xml:space="preserve">In-house architect responsible for planning and QA of offers to customers. Senior developer for some customers.</w:t>
+        <w:rPr>
+          <w:b/>
+          <w:bCs/>
+        </w:rPr>
+        <w:t xml:space="preserve">Frameworks &amp; Libraries:</w:t>
+      </w:r>
+      <w:r>
+        <w:t xml:space="preserve"> </w:t>
+      </w:r>
+      <w:r>
+        <w:t xml:space="preserve">ASP.NET, Akka.NET, Blazor, NHibernate, Episerver, NServiceBus, GraphQL, REST</w:t>
       </w:r>
     </w:p>
     <w:p>
@@ -225,701 +737,182 @@
           <w:b/>
           <w:bCs/>
         </w:rPr>
-        <w:t xml:space="preserve">Customers:</w:t>
-      </w:r>
-      <w:r>
-        <w:t xml:space="preserve"> </w:t>
-      </w:r>
-      <w:r>
-        <w:t xml:space="preserve">Skatteetaten, Helsedirektoratet</w:t>
-      </w:r>
-    </w:p>
-    <w:bookmarkEnd w:id="12"/>
-    <w:bookmarkStart w:id="13" w:name="earlier-positions"/>
-    <w:p>
-      <w:pPr>
-        <w:pStyle w:val="Heading2"/>
-      </w:pPr>
-      <w:r>
-        <w:t xml:space="preserve">Earlier Positions</w:t>
-      </w:r>
-    </w:p>
-    <w:p>
-      <w:pPr>
-        <w:pStyle w:val="Compact"/>
-        <w:numPr>
-          <w:ilvl w:val="0"/>
-          <w:numId w:val="1001"/>
-        </w:numPr>
-      </w:pPr>
-      <w:r>
-        <w:t xml:space="preserve">03/2014 – 08/2017 —</w:t>
-      </w:r>
-      <w:r>
-        <w:t xml:space="preserve"> </w:t>
-      </w:r>
-      <w:r>
-        <w:rPr>
-          <w:b/>
-          <w:bCs/>
-        </w:rPr>
-        <w:t xml:space="preserve">CGI</w:t>
-      </w:r>
-      <w:r>
-        <w:t xml:space="preserve">, Senior Web Developer</w:t>
-      </w:r>
-    </w:p>
-    <w:p>
-      <w:pPr>
-        <w:pStyle w:val="Compact"/>
-        <w:numPr>
-          <w:ilvl w:val="0"/>
-          <w:numId w:val="1001"/>
-        </w:numPr>
-      </w:pPr>
-      <w:r>
-        <w:t xml:space="preserve">03/2010 – 01/2014 —</w:t>
-      </w:r>
-      <w:r>
-        <w:t xml:space="preserve"> </w:t>
-      </w:r>
-      <w:r>
-        <w:rPr>
-          <w:b/>
-          <w:bCs/>
-        </w:rPr>
-        <w:t xml:space="preserve">Making Waves</w:t>
-      </w:r>
-      <w:r>
-        <w:t xml:space="preserve">, Senior Systems Consultant</w:t>
-      </w:r>
-    </w:p>
-    <w:p>
-      <w:pPr>
-        <w:pStyle w:val="Compact"/>
-        <w:numPr>
-          <w:ilvl w:val="0"/>
-          <w:numId w:val="1001"/>
-        </w:numPr>
-      </w:pPr>
-      <w:r>
-        <w:t xml:space="preserve">08/2008 – 12/2009 —</w:t>
-      </w:r>
-      <w:r>
-        <w:t xml:space="preserve"> </w:t>
-      </w:r>
-      <w:r>
-        <w:rPr>
-          <w:b/>
-          <w:bCs/>
-        </w:rPr>
-        <w:t xml:space="preserve">Creuna</w:t>
-      </w:r>
-      <w:r>
-        <w:t xml:space="preserve">, Consultant / Systems Developer</w:t>
-      </w:r>
-    </w:p>
-    <w:p>
-      <w:pPr>
-        <w:pStyle w:val="Compact"/>
-        <w:numPr>
-          <w:ilvl w:val="0"/>
-          <w:numId w:val="1001"/>
-        </w:numPr>
-      </w:pPr>
-      <w:r>
-        <w:t xml:space="preserve">02/2006 – 07/2008 —</w:t>
-      </w:r>
-      <w:r>
-        <w:t xml:space="preserve"> </w:t>
-      </w:r>
-      <w:r>
-        <w:rPr>
-          <w:b/>
-          <w:bCs/>
-        </w:rPr>
-        <w:t xml:space="preserve">Ocelluz</w:t>
-      </w:r>
-      <w:r>
-        <w:t xml:space="preserve">, Systems Developer &amp; Project Manager</w:t>
-      </w:r>
-    </w:p>
-    <w:p>
-      <w:pPr>
-        <w:pStyle w:val="Compact"/>
-        <w:numPr>
-          <w:ilvl w:val="0"/>
-          <w:numId w:val="1001"/>
-        </w:numPr>
-      </w:pPr>
-      <w:r>
-        <w:t xml:space="preserve">10/2004 – 02/2008 —</w:t>
-      </w:r>
-      <w:r>
-        <w:t xml:space="preserve"> </w:t>
-      </w:r>
-      <w:r>
-        <w:rPr>
-          <w:b/>
-          <w:bCs/>
-        </w:rPr>
-        <w:t xml:space="preserve">Anders Nordby Konsulenttjenester</w:t>
-      </w:r>
-    </w:p>
-    <w:p>
-      <w:pPr>
-        <w:pStyle w:val="Compact"/>
-        <w:numPr>
-          <w:ilvl w:val="0"/>
-          <w:numId w:val="1001"/>
-        </w:numPr>
-      </w:pPr>
-      <w:r>
-        <w:t xml:space="preserve">05/1995 – 06/2002 —</w:t>
-      </w:r>
-      <w:r>
-        <w:t xml:space="preserve"> </w:t>
-      </w:r>
-      <w:r>
-        <w:rPr>
-          <w:b/>
-          <w:bCs/>
-        </w:rPr>
-        <w:t xml:space="preserve">Ajilon</w:t>
-      </w:r>
-      <w:r>
-        <w:t xml:space="preserve">, Consultant</w:t>
-      </w:r>
-    </w:p>
-    <w:bookmarkEnd w:id="13"/>
-    <w:bookmarkEnd w:id="14"/>
-    <w:bookmarkStart w:id="15" w:name="education"/>
+        <w:t xml:space="preserve">Cloud &amp; DevOps:</w:t>
+      </w:r>
+      <w:r>
+        <w:t xml:space="preserve"> </w:t>
+      </w:r>
+      <w:r>
+        <w:t xml:space="preserve">Azure, TeamCity, Octopus Deploy, Git</w:t>
+      </w:r>
+    </w:p>
+    <w:p>
+      <w:pPr>
+        <w:pStyle w:val="BodyText"/>
+      </w:pPr>
+      <w:r>
+        <w:rPr>
+          <w:b/>
+          <w:bCs/>
+        </w:rPr>
+        <w:t xml:space="preserve">Testing:</w:t>
+      </w:r>
+      <w:r>
+        <w:t xml:space="preserve"> </w:t>
+      </w:r>
+      <w:r>
+        <w:t xml:space="preserve">NUnit, SpecFlow, jMeter, BlazeMeter</w:t>
+      </w:r>
+    </w:p>
+    <w:p>
+      <w:pPr>
+        <w:pStyle w:val="BodyText"/>
+      </w:pPr>
+      <w:r>
+        <w:rPr>
+          <w:b/>
+          <w:bCs/>
+        </w:rPr>
+        <w:t xml:space="preserve">Security:</w:t>
+      </w:r>
+      <w:r>
+        <w:t xml:space="preserve"> </w:t>
+      </w:r>
+      <w:r>
+        <w:t xml:space="preserve">Kiuwan</w:t>
+      </w:r>
+    </w:p>
+    <w:p>
+      <w:pPr>
+        <w:pStyle w:val="BodyText"/>
+      </w:pPr>
+      <w:r>
+        <w:rPr>
+          <w:b/>
+          <w:bCs/>
+        </w:rPr>
+        <w:t xml:space="preserve">Collaboration:</w:t>
+      </w:r>
+      <w:r>
+        <w:t xml:space="preserve"> </w:t>
+      </w:r>
+      <w:r>
+        <w:t xml:space="preserve">Jira, Confluence</w:t>
+      </w:r>
+    </w:p>
+    <w:p>
+      <w:pPr>
+        <w:pStyle w:val="BodyText"/>
+      </w:pPr>
+      <w:r>
+        <w:rPr>
+          <w:b/>
+          <w:bCs/>
+        </w:rPr>
+        <w:t xml:space="preserve">Methodologies:</w:t>
+      </w:r>
+      <w:r>
+        <w:t xml:space="preserve"> </w:t>
+      </w:r>
+      <w:r>
+        <w:t xml:space="preserve">Systems Architecture, Agile, Scrum, Kanban, Project Management</w:t>
+      </w:r>
+    </w:p>
+    <w:p>
+      <w:pPr>
+        <w:pStyle w:val="BodyText"/>
+      </w:pPr>
+      <w:r>
+        <w:rPr>
+          <w:b/>
+          <w:bCs/>
+        </w:rPr>
+        <w:t xml:space="preserve">Other Tools:</w:t>
+      </w:r>
+      <w:r>
+        <w:t xml:space="preserve"> </w:t>
+      </w:r>
+      <w:r>
+        <w:t xml:space="preserve">LaTeX</w:t>
+      </w:r>
+    </w:p>
+    <w:bookmarkEnd w:id="18"/>
+    <w:bookmarkStart w:id="19" w:name="languages"/>
     <w:p>
       <w:pPr>
         <w:pStyle w:val="Heading1"/>
       </w:pPr>
       <w:r>
-        <w:t xml:space="preserve">Education</w:t>
-      </w:r>
-    </w:p>
-    <w:p>
-      <w:pPr>
-        <w:pStyle w:val="Compact"/>
-        <w:numPr>
-          <w:ilvl w:val="0"/>
-          <w:numId w:val="1002"/>
-        </w:numPr>
-      </w:pPr>
-      <w:r>
-        <w:t xml:space="preserve">Current —</w:t>
-      </w:r>
-      <w:r>
-        <w:t xml:space="preserve"> </w:t>
-      </w:r>
-      <w:r>
-        <w:rPr>
-          <w:b/>
-          <w:bCs/>
-        </w:rPr>
-        <w:t xml:space="preserve">Kristiania University of Applied Sciences</w:t>
-      </w:r>
-      <w:r>
-        <w:t xml:space="preserve">, Cloud Security</w:t>
-      </w:r>
-    </w:p>
-    <w:p>
-      <w:pPr>
-        <w:pStyle w:val="Compact"/>
-        <w:numPr>
-          <w:ilvl w:val="0"/>
-          <w:numId w:val="1002"/>
-        </w:numPr>
-      </w:pPr>
-      <w:r>
-        <w:t xml:space="preserve">2003 – 2004 —</w:t>
-      </w:r>
-      <w:r>
-        <w:t xml:space="preserve"> </w:t>
-      </w:r>
-      <w:r>
-        <w:rPr>
-          <w:b/>
-          <w:bCs/>
-        </w:rPr>
-        <w:t xml:space="preserve">University of Oslo</w:t>
-      </w:r>
-      <w:r>
-        <w:t xml:space="preserve">, Teacher Training</w:t>
-      </w:r>
-    </w:p>
-    <w:p>
-      <w:pPr>
-        <w:pStyle w:val="Compact"/>
-        <w:numPr>
-          <w:ilvl w:val="0"/>
-          <w:numId w:val="1002"/>
-        </w:numPr>
-      </w:pPr>
-      <w:r>
-        <w:t xml:space="preserve">1999 – 2000 —</w:t>
-      </w:r>
-      <w:r>
-        <w:t xml:space="preserve"> </w:t>
-      </w:r>
-      <w:r>
-        <w:rPr>
-          <w:b/>
-          <w:bCs/>
-        </w:rPr>
-        <w:t xml:space="preserve">Oslo Business Academy</w:t>
-      </w:r>
-      <w:r>
-        <w:t xml:space="preserve">, IT Candidate</w:t>
-      </w:r>
-    </w:p>
-    <w:p>
-      <w:pPr>
-        <w:pStyle w:val="Compact"/>
-        <w:numPr>
-          <w:ilvl w:val="0"/>
-          <w:numId w:val="1002"/>
-        </w:numPr>
-      </w:pPr>
-      <w:r>
-        <w:t xml:space="preserve">1987 – 1996 —</w:t>
-      </w:r>
-      <w:r>
-        <w:t xml:space="preserve"> </w:t>
-      </w:r>
-      <w:r>
-        <w:rPr>
-          <w:b/>
-          <w:bCs/>
-        </w:rPr>
-        <w:t xml:space="preserve">University of Oslo</w:t>
-      </w:r>
-      <w:r>
-        <w:t xml:space="preserve">, Cand.Mag.</w:t>
-      </w:r>
-    </w:p>
-    <w:p>
-      <w:pPr>
-        <w:pStyle w:val="Compact"/>
-        <w:numPr>
-          <w:ilvl w:val="0"/>
-          <w:numId w:val="1002"/>
-        </w:numPr>
-      </w:pPr>
-      <w:r>
-        <w:t xml:space="preserve">1984 – 1987 —</w:t>
-      </w:r>
-      <w:r>
-        <w:t xml:space="preserve"> </w:t>
-      </w:r>
-      <w:r>
-        <w:rPr>
-          <w:b/>
-          <w:bCs/>
-        </w:rPr>
-        <w:t xml:space="preserve">Eikeli High School</w:t>
-      </w:r>
-      <w:r>
-        <w:t xml:space="preserve">, Natural Sciences</w:t>
-      </w:r>
-    </w:p>
-    <w:bookmarkEnd w:id="15"/>
-    <w:bookmarkStart w:id="16" w:name="certifications"/>
-    <w:p>
-      <w:pPr>
-        <w:pStyle w:val="Heading1"/>
-      </w:pPr>
-      <w:r>
-        <w:t xml:space="preserve">Certifications</w:t>
-      </w:r>
-    </w:p>
-    <w:p>
-      <w:pPr>
-        <w:pStyle w:val="Compact"/>
-        <w:numPr>
-          <w:ilvl w:val="0"/>
-          <w:numId w:val="1003"/>
-        </w:numPr>
-      </w:pPr>
-      <w:r>
-        <w:t xml:space="preserve">2025 — Goethe-Zertifikat Deutsch B2</w:t>
-      </w:r>
-    </w:p>
-    <w:p>
-      <w:pPr>
-        <w:pStyle w:val="Compact"/>
-        <w:numPr>
-          <w:ilvl w:val="0"/>
-          <w:numId w:val="1003"/>
-        </w:numPr>
-      </w:pPr>
-      <w:r>
-        <w:t xml:space="preserve">2025 — SecureFlag: Secure Coding</w:t>
-      </w:r>
-    </w:p>
-    <w:p>
-      <w:pPr>
-        <w:pStyle w:val="Compact"/>
-        <w:numPr>
-          <w:ilvl w:val="0"/>
-          <w:numId w:val="1003"/>
-        </w:numPr>
-      </w:pPr>
-      <w:r>
-        <w:t xml:space="preserve">2021 — Certified Optimizely Developer</w:t>
-      </w:r>
-    </w:p>
-    <w:p>
-      <w:pPr>
-        <w:pStyle w:val="Compact"/>
-        <w:numPr>
-          <w:ilvl w:val="0"/>
-          <w:numId w:val="1003"/>
-        </w:numPr>
-      </w:pPr>
-      <w:r>
-        <w:t xml:space="preserve">2020 — Microsoft AZ900 Azure Fundamentals</w:t>
-      </w:r>
-    </w:p>
-    <w:p>
-      <w:pPr>
-        <w:pStyle w:val="Compact"/>
-        <w:numPr>
-          <w:ilvl w:val="0"/>
-          <w:numId w:val="1003"/>
-        </w:numPr>
-      </w:pPr>
-      <w:r>
-        <w:t xml:space="preserve">2018-2019 — PRINCE2 Foundation &amp; Practitioner</w:t>
-      </w:r>
-    </w:p>
-    <w:p>
-      <w:pPr>
-        <w:pStyle w:val="Compact"/>
-        <w:numPr>
-          <w:ilvl w:val="0"/>
-          <w:numId w:val="1003"/>
-        </w:numPr>
-      </w:pPr>
-      <w:r>
-        <w:t xml:space="preserve">2019 — Certified Scrum Master</w:t>
-      </w:r>
-    </w:p>
-    <w:bookmarkEnd w:id="16"/>
-    <w:bookmarkStart w:id="17" w:name="courses"/>
-    <w:p>
-      <w:pPr>
-        <w:pStyle w:val="Heading1"/>
-      </w:pPr>
-      <w:r>
-        <w:t xml:space="preserve">Courses</w:t>
-      </w:r>
-    </w:p>
-    <w:p>
-      <w:pPr>
-        <w:pStyle w:val="Compact"/>
-        <w:numPr>
-          <w:ilvl w:val="0"/>
-          <w:numId w:val="1004"/>
-        </w:numPr>
-      </w:pPr>
-      <w:r>
-        <w:t xml:space="preserve">2024 — Building an AppSec Scanning Programme</w:t>
-      </w:r>
-    </w:p>
-    <w:p>
-      <w:pPr>
-        <w:pStyle w:val="Compact"/>
-        <w:numPr>
-          <w:ilvl w:val="0"/>
-          <w:numId w:val="1004"/>
-        </w:numPr>
-      </w:pPr>
-      <w:r>
-        <w:t xml:space="preserve">2019 — Tom Gilb: Architecture Workshop</w:t>
-      </w:r>
-    </w:p>
-    <w:p>
-      <w:pPr>
-        <w:pStyle w:val="Compact"/>
-        <w:numPr>
-          <w:ilvl w:val="0"/>
-          <w:numId w:val="1004"/>
-        </w:numPr>
-      </w:pPr>
-      <w:r>
-        <w:t xml:space="preserve">2018 — Sopra Steria: Software Architecture School</w:t>
-      </w:r>
-    </w:p>
-    <w:p>
-      <w:pPr>
-        <w:pStyle w:val="Compact"/>
-        <w:numPr>
-          <w:ilvl w:val="0"/>
-          <w:numId w:val="1004"/>
-        </w:numPr>
-      </w:pPr>
-      <w:r>
-        <w:t xml:space="preserve">2015 — Microsoft: Lead Enterprise Architect Programme</w:t>
-      </w:r>
-    </w:p>
-    <w:bookmarkEnd w:id="17"/>
-    <w:bookmarkStart w:id="18" w:name="awards"/>
-    <w:p>
-      <w:pPr>
-        <w:pStyle w:val="Heading1"/>
-      </w:pPr>
-      <w:r>
-        <w:t xml:space="preserve">Awards</w:t>
-      </w:r>
-    </w:p>
-    <w:p>
-      <w:pPr>
-        <w:pStyle w:val="Compact"/>
-        <w:numPr>
-          <w:ilvl w:val="0"/>
-          <w:numId w:val="1005"/>
-        </w:numPr>
-      </w:pPr>
-      <w:r>
-        <w:t xml:space="preserve">2013-2017 — Episerver Most Valued Professional</w:t>
-      </w:r>
-    </w:p>
-    <w:bookmarkEnd w:id="18"/>
-    <w:bookmarkStart w:id="19" w:name="skills"/>
-    <w:p>
-      <w:pPr>
-        <w:pStyle w:val="Heading1"/>
-      </w:pPr>
-      <w:r>
-        <w:t xml:space="preserve">Skills</w:t>
-      </w:r>
-    </w:p>
-    <w:p>
-      <w:pPr>
-        <w:pStyle w:val="FirstParagraph"/>
-      </w:pPr>
-      <w:r>
-        <w:rPr>
-          <w:b/>
-          <w:bCs/>
-        </w:rPr>
-        <w:t xml:space="preserve">Languages:</w:t>
-      </w:r>
-      <w:r>
-        <w:t xml:space="preserve"> </w:t>
-      </w:r>
-      <w:r>
-        <w:t xml:space="preserve">C#, JavaScript, SQL, PowerShell</w:t>
-      </w:r>
-    </w:p>
-    <w:p>
-      <w:pPr>
-        <w:pStyle w:val="BodyText"/>
-      </w:pPr>
-      <w:r>
-        <w:rPr>
-          <w:b/>
-          <w:bCs/>
-        </w:rPr>
-        <w:t xml:space="preserve">Frameworks &amp; Libraries:</w:t>
-      </w:r>
-      <w:r>
-        <w:t xml:space="preserve"> </w:t>
-      </w:r>
-      <w:r>
-        <w:t xml:space="preserve">ASP.NET, Akka.NET, Blazor, NHibernate, Episerver, NServiceBus, GraphQL, REST</w:t>
-      </w:r>
-    </w:p>
-    <w:p>
-      <w:pPr>
-        <w:pStyle w:val="BodyText"/>
-      </w:pPr>
-      <w:r>
-        <w:rPr>
-          <w:b/>
-          <w:bCs/>
-        </w:rPr>
-        <w:t xml:space="preserve">Cloud &amp; DevOps:</w:t>
-      </w:r>
-      <w:r>
-        <w:t xml:space="preserve"> </w:t>
-      </w:r>
-      <w:r>
-        <w:t xml:space="preserve">Azure, TeamCity, Octopus Deploy, Git</w:t>
-      </w:r>
-    </w:p>
-    <w:p>
-      <w:pPr>
-        <w:pStyle w:val="BodyText"/>
-      </w:pPr>
-      <w:r>
-        <w:rPr>
-          <w:b/>
-          <w:bCs/>
-        </w:rPr>
-        <w:t xml:space="preserve">Testing:</w:t>
-      </w:r>
-      <w:r>
-        <w:t xml:space="preserve"> </w:t>
-      </w:r>
-      <w:r>
-        <w:t xml:space="preserve">NUnit, SpecFlow, jMeter, BlazeMeter</w:t>
-      </w:r>
-    </w:p>
-    <w:p>
-      <w:pPr>
-        <w:pStyle w:val="BodyText"/>
-      </w:pPr>
-      <w:r>
-        <w:rPr>
-          <w:b/>
-          <w:bCs/>
-        </w:rPr>
-        <w:t xml:space="preserve">Security:</w:t>
-      </w:r>
-      <w:r>
-        <w:t xml:space="preserve"> </w:t>
-      </w:r>
-      <w:r>
-        <w:t xml:space="preserve">Kiuwan</w:t>
-      </w:r>
-    </w:p>
-    <w:p>
-      <w:pPr>
-        <w:pStyle w:val="BodyText"/>
-      </w:pPr>
-      <w:r>
-        <w:rPr>
-          <w:b/>
-          <w:bCs/>
-        </w:rPr>
-        <w:t xml:space="preserve">Collaboration:</w:t>
-      </w:r>
-      <w:r>
-        <w:t xml:space="preserve"> </w:t>
-      </w:r>
-      <w:r>
-        <w:t xml:space="preserve">Jira, Confluence</w:t>
-      </w:r>
-    </w:p>
-    <w:p>
-      <w:pPr>
-        <w:pStyle w:val="BodyText"/>
-      </w:pPr>
-      <w:r>
-        <w:rPr>
-          <w:b/>
-          <w:bCs/>
-        </w:rPr>
-        <w:t xml:space="preserve">Methodologies:</w:t>
-      </w:r>
-      <w:r>
-        <w:t xml:space="preserve"> </w:t>
-      </w:r>
-      <w:r>
-        <w:t xml:space="preserve">Systems Architecture, Agile, Scrum, Kanban, Project Management</w:t>
-      </w:r>
-    </w:p>
-    <w:p>
-      <w:pPr>
-        <w:pStyle w:val="BodyText"/>
-      </w:pPr>
-      <w:r>
-        <w:rPr>
-          <w:b/>
-          <w:bCs/>
-        </w:rPr>
-        <w:t xml:space="preserve">Other Tools:</w:t>
-      </w:r>
-      <w:r>
-        <w:t xml:space="preserve"> </w:t>
-      </w:r>
-      <w:r>
-        <w:t xml:space="preserve">LaTeX</w:t>
+        <w:t xml:space="preserve">Languages</w:t>
+      </w:r>
+    </w:p>
+    <w:p>
+      <w:pPr>
+        <w:pStyle w:val="Compact"/>
+        <w:numPr>
+          <w:ilvl w:val="0"/>
+          <w:numId w:val="1006"/>
+        </w:numPr>
+      </w:pPr>
+      <w:r>
+        <w:rPr>
+          <w:b/>
+          <w:bCs/>
+        </w:rPr>
+        <w:t xml:space="preserve">Professional:</w:t>
+      </w:r>
+      <w:r>
+        <w:t xml:space="preserve"> </w:t>
+      </w:r>
+      <w:r>
+        <w:t xml:space="preserve">Norwegian (native), English</w:t>
+      </w:r>
+    </w:p>
+    <w:p>
+      <w:pPr>
+        <w:pStyle w:val="Compact"/>
+        <w:numPr>
+          <w:ilvl w:val="0"/>
+          <w:numId w:val="1006"/>
+        </w:numPr>
+      </w:pPr>
+      <w:r>
+        <w:rPr>
+          <w:b/>
+          <w:bCs/>
+        </w:rPr>
+        <w:t xml:space="preserve">Conversational:</w:t>
+      </w:r>
+      <w:r>
+        <w:t xml:space="preserve"> </w:t>
+      </w:r>
+      <w:r>
+        <w:t xml:space="preserve">German (B2), Bulgarian</w:t>
+      </w:r>
+    </w:p>
+    <w:p>
+      <w:pPr>
+        <w:pStyle w:val="Compact"/>
+        <w:numPr>
+          <w:ilvl w:val="0"/>
+          <w:numId w:val="1006"/>
+        </w:numPr>
+      </w:pPr>
+      <w:r>
+        <w:rPr>
+          <w:b/>
+          <w:bCs/>
+        </w:rPr>
+        <w:t xml:space="preserve">Beginner:</w:t>
+      </w:r>
+      <w:r>
+        <w:t xml:space="preserve"> </w:t>
+      </w:r>
+      <w:r>
+        <w:t xml:space="preserve">Spanish, Catalan, Japanese</w:t>
       </w:r>
     </w:p>
     <w:bookmarkEnd w:id="19"/>
-    <w:bookmarkStart w:id="20" w:name="languages"/>
-    <w:p>
-      <w:pPr>
-        <w:pStyle w:val="Heading1"/>
-      </w:pPr>
-      <w:r>
-        <w:t xml:space="preserve">Languages</w:t>
-      </w:r>
-    </w:p>
-    <w:p>
-      <w:pPr>
-        <w:pStyle w:val="Compact"/>
-        <w:numPr>
-          <w:ilvl w:val="0"/>
-          <w:numId w:val="1006"/>
-        </w:numPr>
-      </w:pPr>
-      <w:r>
-        <w:rPr>
-          <w:b/>
-          <w:bCs/>
-        </w:rPr>
-        <w:t xml:space="preserve">Professional:</w:t>
-      </w:r>
-      <w:r>
-        <w:t xml:space="preserve"> </w:t>
-      </w:r>
-      <w:r>
-        <w:t xml:space="preserve">Norwegian (native), English</w:t>
-      </w:r>
-    </w:p>
-    <w:p>
-      <w:pPr>
-        <w:pStyle w:val="Compact"/>
-        <w:numPr>
-          <w:ilvl w:val="0"/>
-          <w:numId w:val="1006"/>
-        </w:numPr>
-      </w:pPr>
-      <w:r>
-        <w:rPr>
-          <w:b/>
-          <w:bCs/>
-        </w:rPr>
-        <w:t xml:space="preserve">Conversational:</w:t>
-      </w:r>
-      <w:r>
-        <w:t xml:space="preserve"> </w:t>
-      </w:r>
-      <w:r>
-        <w:t xml:space="preserve">German (B2), Bulgarian</w:t>
-      </w:r>
-    </w:p>
-    <w:p>
-      <w:pPr>
-        <w:pStyle w:val="Compact"/>
-        <w:numPr>
-          <w:ilvl w:val="0"/>
-          <w:numId w:val="1006"/>
-        </w:numPr>
-      </w:pPr>
-      <w:r>
-        <w:rPr>
-          <w:b/>
-          <w:bCs/>
-        </w:rPr>
-        <w:t xml:space="preserve">Beginner:</w:t>
-      </w:r>
-      <w:r>
-        <w:t xml:space="preserve"> </w:t>
-      </w:r>
-      <w:r>
-        <w:t xml:space="preserve">Spanish, Catalan, Japanese</w:t>
-      </w:r>
-    </w:p>
-    <w:bookmarkEnd w:id="20"/>
     <w:sectPr>
       <w:footnotePr>
         <w:numRestart w:val="eachSect"/>

</xml_diff>

<commit_message>
publish: subsection-styled Earlier Positions heading + content rebuild
</commit_message>
<xml_diff>
--- a/CV_Anders_G_Nordby_EN/CV_Anders_G_Nordby_EN_ATS.docx
+++ b/CV_Anders_G_Nordby_EN/CV_Anders_G_Nordby_EN_ATS.docx
@@ -56,7 +56,7 @@
       </w:r>
     </w:p>
     <w:bookmarkEnd w:id="10"/>
-    <w:bookmarkStart w:id="13" w:name="work-experience"/>
+    <w:bookmarkStart w:id="14" w:name="work-experience"/>
     <w:p>
       <w:pPr>
         <w:pStyle w:val="Heading1"/>
@@ -203,12 +203,56 @@
       </w:r>
     </w:p>
     <w:bookmarkEnd w:id="11"/>
-    <w:bookmarkStart w:id="12" w:name="earlier-positions"/>
+    <w:bookmarkStart w:id="12" w:name="lead-software-engineer-sopra-steria"/>
     <w:p>
       <w:pPr>
         <w:pStyle w:val="Heading2"/>
       </w:pPr>
       <w:r>
+        <w:t xml:space="preserve">Lead Software Engineer — Sopra Steria</w:t>
+      </w:r>
+    </w:p>
+    <w:p>
+      <w:pPr>
+        <w:pStyle w:val="FirstParagraph"/>
+      </w:pPr>
+      <w:r>
+        <w:t xml:space="preserve">01/2018 – 04/2019</w:t>
+      </w:r>
+    </w:p>
+    <w:p>
+      <w:pPr>
+        <w:pStyle w:val="BodyText"/>
+      </w:pPr>
+      <w:r>
+        <w:t xml:space="preserve">In-house architect responsible for technical planning and quality assurance of customer proposals — including bids to Skatteetaten (Norwegian Tax Authority) and Helsedirektoratet (Directorate of Health), two of Norway’s largest public-sector IT clients. Owned pre-sales architecture decisions across C#/.NET, Episerver CMS, ASP.NET MVC and SQL Server.</w:t>
+      </w:r>
+    </w:p>
+    <w:p>
+      <w:pPr>
+        <w:pStyle w:val="BodyText"/>
+      </w:pPr>
+      <w:r>
+        <w:rPr>
+          <w:b/>
+          <w:bCs/>
+        </w:rPr>
+        <w:t xml:space="preserve">Customers:</w:t>
+      </w:r>
+      <w:r>
+        <w:t xml:space="preserve"> </w:t>
+      </w:r>
+      <w:r>
+        <w:t xml:space="preserve">Skatteetaten, Helsedirektoratet</w:t>
+      </w:r>
+    </w:p>
+    <w:bookmarkEnd w:id="12"/>
+    <w:bookmarkStart w:id="13" w:name="earlier-positions"/>
+    <w:p>
+      <w:pPr>
+        <w:pStyle w:val="Heading2"/>
+      </w:pPr>
+      <w:r>
         <w:t xml:space="preserve">Earlier Positions</w:t>
       </w:r>
     </w:p>
@@ -221,20 +265,20 @@
         </w:numPr>
       </w:pPr>
       <w:r>
-        <w:t xml:space="preserve">01/2018 – 04/2019 —</w:t>
-      </w:r>
-      <w:r>
-        <w:t xml:space="preserve"> </w:t>
-      </w:r>
-      <w:r>
-        <w:rPr>
-          <w:b/>
-          <w:bCs/>
-        </w:rPr>
-        <w:t xml:space="preserve">Sopra Steria</w:t>
-      </w:r>
-      <w:r>
-        <w:t xml:space="preserve">, Lead Software Engineer</w:t>
+        <w:t xml:space="preserve">03/2014 – 08/2017 —</w:t>
+      </w:r>
+      <w:r>
+        <w:t xml:space="preserve"> </w:t>
+      </w:r>
+      <w:r>
+        <w:rPr>
+          <w:b/>
+          <w:bCs/>
+        </w:rPr>
+        <w:t xml:space="preserve">CGI</w:t>
+      </w:r>
+      <w:r>
+        <w:t xml:space="preserve">, Senior Web Developer</w:t>
       </w:r>
     </w:p>
     <w:p>
@@ -246,20 +290,20 @@
         </w:numPr>
       </w:pPr>
       <w:r>
-        <w:t xml:space="preserve">03/2014 – 08/2017 —</w:t>
-      </w:r>
-      <w:r>
-        <w:t xml:space="preserve"> </w:t>
-      </w:r>
-      <w:r>
-        <w:rPr>
-          <w:b/>
-          <w:bCs/>
-        </w:rPr>
-        <w:t xml:space="preserve">CGI</w:t>
-      </w:r>
-      <w:r>
-        <w:t xml:space="preserve">, Senior Web Developer</w:t>
+        <w:t xml:space="preserve">03/2010 – 01/2014 —</w:t>
+      </w:r>
+      <w:r>
+        <w:t xml:space="preserve"> </w:t>
+      </w:r>
+      <w:r>
+        <w:rPr>
+          <w:b/>
+          <w:bCs/>
+        </w:rPr>
+        <w:t xml:space="preserve">Making Waves</w:t>
+      </w:r>
+      <w:r>
+        <w:t xml:space="preserve">, Senior Systems Consultant</w:t>
       </w:r>
     </w:p>
     <w:p>
@@ -271,20 +315,20 @@
         </w:numPr>
       </w:pPr>
       <w:r>
-        <w:t xml:space="preserve">03/2010 – 01/2014 —</w:t>
-      </w:r>
-      <w:r>
-        <w:t xml:space="preserve"> </w:t>
-      </w:r>
-      <w:r>
-        <w:rPr>
-          <w:b/>
-          <w:bCs/>
-        </w:rPr>
-        <w:t xml:space="preserve">Making Waves</w:t>
-      </w:r>
-      <w:r>
-        <w:t xml:space="preserve">, Senior Systems Consultant</w:t>
+        <w:t xml:space="preserve">08/2008 – 12/2009 —</w:t>
+      </w:r>
+      <w:r>
+        <w:t xml:space="preserve"> </w:t>
+      </w:r>
+      <w:r>
+        <w:rPr>
+          <w:b/>
+          <w:bCs/>
+        </w:rPr>
+        <w:t xml:space="preserve">Creuna</w:t>
+      </w:r>
+      <w:r>
+        <w:t xml:space="preserve">, Consultant / Systems Developer</w:t>
       </w:r>
     </w:p>
     <w:p>
@@ -296,20 +340,20 @@
         </w:numPr>
       </w:pPr>
       <w:r>
-        <w:t xml:space="preserve">08/2008 – 12/2009 —</w:t>
-      </w:r>
-      <w:r>
-        <w:t xml:space="preserve"> </w:t>
-      </w:r>
-      <w:r>
-        <w:rPr>
-          <w:b/>
-          <w:bCs/>
-        </w:rPr>
-        <w:t xml:space="preserve">Creuna</w:t>
-      </w:r>
-      <w:r>
-        <w:t xml:space="preserve">, Consultant / Systems Developer</w:t>
+        <w:t xml:space="preserve">02/2006 – 07/2008 —</w:t>
+      </w:r>
+      <w:r>
+        <w:t xml:space="preserve"> </w:t>
+      </w:r>
+      <w:r>
+        <w:rPr>
+          <w:b/>
+          <w:bCs/>
+        </w:rPr>
+        <w:t xml:space="preserve">Ocelluz</w:t>
+      </w:r>
+      <w:r>
+        <w:t xml:space="preserve">, Systems Developer &amp; Project Manager</w:t>
       </w:r>
     </w:p>
     <w:p>
@@ -321,20 +365,17 @@
         </w:numPr>
       </w:pPr>
       <w:r>
-        <w:t xml:space="preserve">02/2006 – 07/2008 —</w:t>
-      </w:r>
-      <w:r>
-        <w:t xml:space="preserve"> </w:t>
-      </w:r>
-      <w:r>
-        <w:rPr>
-          <w:b/>
-          <w:bCs/>
-        </w:rPr>
-        <w:t xml:space="preserve">Ocelluz</w:t>
-      </w:r>
-      <w:r>
-        <w:t xml:space="preserve">, Systems Developer &amp; Project Manager</w:t>
+        <w:t xml:space="preserve">10/2004 – 02/2008 —</w:t>
+      </w:r>
+      <w:r>
+        <w:t xml:space="preserve"> </w:t>
+      </w:r>
+      <w:r>
+        <w:rPr>
+          <w:b/>
+          <w:bCs/>
+        </w:rPr>
+        <w:t xml:space="preserve">Anders Nordby Konsulenttjenester</w:t>
       </w:r>
     </w:p>
     <w:p>
@@ -346,28 +387,6 @@
         </w:numPr>
       </w:pPr>
       <w:r>
-        <w:t xml:space="preserve">10/2004 – 02/2008 —</w:t>
-      </w:r>
-      <w:r>
-        <w:t xml:space="preserve"> </w:t>
-      </w:r>
-      <w:r>
-        <w:rPr>
-          <w:b/>
-          <w:bCs/>
-        </w:rPr>
-        <w:t xml:space="preserve">Anders Nordby Konsulenttjenester</w:t>
-      </w:r>
-    </w:p>
-    <w:p>
-      <w:pPr>
-        <w:pStyle w:val="Compact"/>
-        <w:numPr>
-          <w:ilvl w:val="0"/>
-          <w:numId w:val="1001"/>
-        </w:numPr>
-      </w:pPr>
-      <w:r>
         <w:t xml:space="preserve">05/1995 – 06/2002 —</w:t>
       </w:r>
       <w:r>
@@ -384,9 +403,9 @@
         <w:t xml:space="preserve">, Consultant</w:t>
       </w:r>
     </w:p>
-    <w:bookmarkEnd w:id="12"/>
     <w:bookmarkEnd w:id="13"/>
-    <w:bookmarkStart w:id="14" w:name="education"/>
+    <w:bookmarkEnd w:id="14"/>
+    <w:bookmarkStart w:id="15" w:name="education"/>
     <w:p>
       <w:pPr>
         <w:pStyle w:val="Heading1"/>
@@ -520,8 +539,8 @@
         <w:t xml:space="preserve">, Natural Sciences</w:t>
       </w:r>
     </w:p>
-    <w:bookmarkEnd w:id="14"/>
-    <w:bookmarkStart w:id="15" w:name="certifications"/>
+    <w:bookmarkEnd w:id="15"/>
+    <w:bookmarkStart w:id="16" w:name="certifications"/>
     <w:p>
       <w:pPr>
         <w:pStyle w:val="Heading1"/>
@@ -602,8 +621,8 @@
         <w:t xml:space="preserve">2019 — Certified Scrum Master</w:t>
       </w:r>
     </w:p>
-    <w:bookmarkEnd w:id="15"/>
-    <w:bookmarkStart w:id="16" w:name="courses"/>
+    <w:bookmarkEnd w:id="16"/>
+    <w:bookmarkStart w:id="17" w:name="courses"/>
     <w:p>
       <w:pPr>
         <w:pStyle w:val="Heading1"/>
@@ -660,8 +679,8 @@
         <w:t xml:space="preserve">2015 — Microsoft: Lead Enterprise Architect Programme</w:t>
       </w:r>
     </w:p>
-    <w:bookmarkEnd w:id="16"/>
-    <w:bookmarkStart w:id="17" w:name="awards"/>
+    <w:bookmarkEnd w:id="17"/>
+    <w:bookmarkStart w:id="18" w:name="awards"/>
     <w:p>
       <w:pPr>
         <w:pStyle w:val="Heading1"/>
@@ -682,8 +701,8 @@
         <w:t xml:space="preserve">2013-2017 — Episerver Most Valued Professional</w:t>
       </w:r>
     </w:p>
-    <w:bookmarkEnd w:id="17"/>
-    <w:bookmarkStart w:id="18" w:name="skills"/>
+    <w:bookmarkEnd w:id="18"/>
+    <w:bookmarkStart w:id="19" w:name="skills"/>
     <w:p>
       <w:pPr>
         <w:pStyle w:val="Heading1"/>
@@ -836,8 +855,8 @@
         <w:t xml:space="preserve">LaTeX</w:t>
       </w:r>
     </w:p>
-    <w:bookmarkEnd w:id="18"/>
-    <w:bookmarkStart w:id="19" w:name="languages"/>
+    <w:bookmarkEnd w:id="19"/>
+    <w:bookmarkStart w:id="20" w:name="languages"/>
     <w:p>
       <w:pPr>
         <w:pStyle w:val="Heading1"/>
@@ -912,7 +931,7 @@
         <w:t xml:space="preserve">Spanish, Catalan, Japanese</w:t>
       </w:r>
     </w:p>
-    <w:bookmarkEnd w:id="19"/>
+    <w:bookmarkEnd w:id="20"/>
     <w:sectPr>
       <w:footnotePr>
         <w:numRestart w:val="eachSect"/>

</xml_diff>

<commit_message>
Publish updated CV: add iOS app projects and Freeman layout refinements
Regenerated from private repo (source commit 50d15c6):
- Projects section with The Sit and Memorize Text
- Freeman layout tweaks (Projects placement, Awards/Languages swap,
  link wrapping, education line break)

Co-Authored-By: Claude Opus 4.8 (1M context) <noreply@anthropic.com>
</commit_message>
<xml_diff>
--- a/CV_Anders_G_Nordby_EN/CV_Anders_G_Nordby_EN_ATS.docx
+++ b/CV_Anders_G_Nordby_EN/CV_Anders_G_Nordby_EN_ATS.docx
@@ -405,7 +405,75 @@
     </w:p>
     <w:bookmarkEnd w:id="13"/>
     <w:bookmarkEnd w:id="14"/>
-    <w:bookmarkStart w:id="15" w:name="education"/>
+    <w:bookmarkStart w:id="19" w:name="projects"/>
+    <w:p>
+      <w:pPr>
+        <w:pStyle w:val="Heading1"/>
+      </w:pPr>
+      <w:r>
+        <w:t xml:space="preserve">Projects</w:t>
+      </w:r>
+    </w:p>
+    <w:bookmarkStart w:id="16" w:name="ios-app-the-sit-meditation-journal"/>
+    <w:p>
+      <w:pPr>
+        <w:pStyle w:val="Heading2"/>
+      </w:pPr>
+      <w:r>
+        <w:t xml:space="preserve">iOS app: The Sit – Meditation &amp; Journal</w:t>
+      </w:r>
+    </w:p>
+    <w:p>
+      <w:pPr>
+        <w:pStyle w:val="FirstParagraph"/>
+      </w:pPr>
+      <w:r>
+        <w:t xml:space="preserve">03/2026 – present |</w:t>
+      </w:r>
+      <w:r>
+        <w:t xml:space="preserve"> </w:t>
+      </w:r>
+      <w:hyperlink r:id="rId15">
+        <w:r>
+          <w:rPr>
+            <w:rStyle w:val="Hyperlink"/>
+          </w:rPr>
+          <w:t xml:space="preserve">https://apps.apple.com/us/app/the-sit-meditation-journal/id6764345510</w:t>
+        </w:r>
+      </w:hyperlink>
+    </w:p>
+    <w:bookmarkEnd w:id="16"/>
+    <w:bookmarkStart w:id="18" w:name="ios-app-memorize-text"/>
+    <w:p>
+      <w:pPr>
+        <w:pStyle w:val="Heading2"/>
+      </w:pPr>
+      <w:r>
+        <w:t xml:space="preserve">iOS app: Memorize Text</w:t>
+      </w:r>
+    </w:p>
+    <w:p>
+      <w:pPr>
+        <w:pStyle w:val="FirstParagraph"/>
+      </w:pPr>
+      <w:r>
+        <w:t xml:space="preserve">12/2025 – present |</w:t>
+      </w:r>
+      <w:r>
+        <w:t xml:space="preserve"> </w:t>
+      </w:r>
+      <w:hyperlink r:id="rId17">
+        <w:r>
+          <w:rPr>
+            <w:rStyle w:val="Hyperlink"/>
+          </w:rPr>
+          <w:t xml:space="preserve">https://apps.apple.com/us/app/memorize-text/id6758014795</w:t>
+        </w:r>
+      </w:hyperlink>
+    </w:p>
+    <w:bookmarkEnd w:id="18"/>
+    <w:bookmarkEnd w:id="19"/>
+    <w:bookmarkStart w:id="20" w:name="education"/>
     <w:p>
       <w:pPr>
         <w:pStyle w:val="Heading1"/>
@@ -423,7 +491,7 @@
         </w:numPr>
       </w:pPr>
       <w:r>
-        <w:t xml:space="preserve">Current —</w:t>
+        <w:t xml:space="preserve">2025 – 2026 —</w:t>
       </w:r>
       <w:r>
         <w:t xml:space="preserve"> </w:t>
@@ -539,8 +607,8 @@
         <w:t xml:space="preserve">, Natural Sciences</w:t>
       </w:r>
     </w:p>
-    <w:bookmarkEnd w:id="15"/>
-    <w:bookmarkStart w:id="16" w:name="certifications"/>
+    <w:bookmarkEnd w:id="20"/>
+    <w:bookmarkStart w:id="21" w:name="certifications"/>
     <w:p>
       <w:pPr>
         <w:pStyle w:val="Heading1"/>
@@ -621,8 +689,8 @@
         <w:t xml:space="preserve">2019 — Certified Scrum Master</w:t>
       </w:r>
     </w:p>
-    <w:bookmarkEnd w:id="16"/>
-    <w:bookmarkStart w:id="17" w:name="courses"/>
+    <w:bookmarkEnd w:id="21"/>
+    <w:bookmarkStart w:id="22" w:name="courses"/>
     <w:p>
       <w:pPr>
         <w:pStyle w:val="Heading1"/>
@@ -679,8 +747,8 @@
         <w:t xml:space="preserve">2015 — Microsoft: Lead Enterprise Architect Programme</w:t>
       </w:r>
     </w:p>
-    <w:bookmarkEnd w:id="17"/>
-    <w:bookmarkStart w:id="18" w:name="awards"/>
+    <w:bookmarkEnd w:id="22"/>
+    <w:bookmarkStart w:id="23" w:name="awards"/>
     <w:p>
       <w:pPr>
         <w:pStyle w:val="Heading1"/>
@@ -701,8 +769,8 @@
         <w:t xml:space="preserve">2013-2017 — Episerver Most Valued Professional</w:t>
       </w:r>
     </w:p>
-    <w:bookmarkEnd w:id="18"/>
-    <w:bookmarkStart w:id="19" w:name="skills"/>
+    <w:bookmarkEnd w:id="23"/>
+    <w:bookmarkStart w:id="24" w:name="skills"/>
     <w:p>
       <w:pPr>
         <w:pStyle w:val="Heading1"/>
@@ -855,8 +923,8 @@
         <w:t xml:space="preserve">LaTeX</w:t>
       </w:r>
     </w:p>
-    <w:bookmarkEnd w:id="19"/>
-    <w:bookmarkStart w:id="20" w:name="languages"/>
+    <w:bookmarkEnd w:id="24"/>
+    <w:bookmarkStart w:id="25" w:name="languages"/>
     <w:p>
       <w:pPr>
         <w:pStyle w:val="Heading1"/>
@@ -931,7 +999,7 @@
         <w:t xml:space="preserve">Spanish, Catalan, Japanese</w:t>
       </w:r>
     </w:p>
-    <w:bookmarkEnd w:id="20"/>
+    <w:bookmarkEnd w:id="25"/>
     <w:sectPr>
       <w:footnotePr>
         <w:numRestart w:val="eachSect"/>

</xml_diff>